<commit_message>
Remove virtual environment and update gitignore
</commit_message>
<xml_diff>
--- a/Avances_Proyecto/Pruebas/Sistema_entrada/Prueba de signature Interpretador.docx
+++ b/Avances_Proyecto/Pruebas/Sistema_entrada/Prueba de signature Interpretador.docx
@@ -284,7 +284,13 @@
       </w:r>
       <w:r>
         <w:lastRenderedPageBreak/>
-        <w:t>cada valor corresponde a una solicitud específica y detallada, junto con el escenario de entrada asociado.</w:t>
+        <w:t>cada valor corresponde a una solicitud específica y detallada, junto con el escenario de entrada asociado</w:t>
+      </w:r>
+      <w:r>
+        <w:t xml:space="preserve"> y el formato esperado de salida</w:t>
+      </w:r>
+      <w:r>
+        <w:t>.</w:t>
       </w:r>
     </w:p>
     <w:p>
@@ -485,15 +491,7 @@
         <w:t>:</w:t>
       </w:r>
       <w:r>
-        <w:t xml:space="preserve"> </w:t>
-      </w:r>
-      <w:proofErr w:type="spellStart"/>
-      <w:r>
-        <w:t>dict</w:t>
-      </w:r>
-      <w:proofErr w:type="spellEnd"/>
-      <w:r>
-        <w:t xml:space="preserve"> = </w:t>
+        <w:t xml:space="preserve"> dict = </w:t>
       </w:r>
       <w:proofErr w:type="spellStart"/>
       <w:proofErr w:type="gramStart"/>
@@ -1929,6 +1927,60 @@
       </w:r>
       <w:proofErr w:type="spellEnd"/>
       <w:r>
+        <w:t xml:space="preserve">: dict = </w:t>
+      </w:r>
+      <w:proofErr w:type="spellStart"/>
+      <w:proofErr w:type="gramStart"/>
+      <w:r>
+        <w:t>dspy.InputField</w:t>
+      </w:r>
+      <w:proofErr w:type="spellEnd"/>
+      <w:proofErr w:type="gramEnd"/>
+      <w:r>
+        <w:t>(</w:t>
+      </w:r>
+    </w:p>
+    <w:p>
+      <w:r>
+        <w:t xml:space="preserve">        </w:t>
+      </w:r>
+      <w:proofErr w:type="spellStart"/>
+      <w:r>
+        <w:t>desc</w:t>
+      </w:r>
+      <w:proofErr w:type="spellEnd"/>
+      <w:proofErr w:type="gramStart"/>
+      <w:r>
+        <w:t>=(</w:t>
+      </w:r>
+      <w:proofErr w:type="gramEnd"/>
+    </w:p>
+    <w:p>
+      <w:r>
+        <w:t>            "Escenarios estructurados admitidos por el sistema."</w:t>
+      </w:r>
+    </w:p>
+    <w:p>
+      <w:r>
+        <w:t>        )</w:t>
+      </w:r>
+    </w:p>
+    <w:p>
+      <w:r>
+        <w:t xml:space="preserve">    )   </w:t>
+      </w:r>
+    </w:p>
+    <w:p/>
+    <w:p>
+      <w:r>
+        <w:t xml:space="preserve">    </w:t>
+      </w:r>
+      <w:proofErr w:type="spellStart"/>
+      <w:r>
+        <w:t>solicitudes_categorizadas</w:t>
+      </w:r>
+      <w:proofErr w:type="spellEnd"/>
+      <w:r>
         <w:t xml:space="preserve">: </w:t>
       </w:r>
       <w:proofErr w:type="spellStart"/>
@@ -1942,7 +1994,7 @@
       <w:proofErr w:type="spellStart"/>
       <w:proofErr w:type="gramStart"/>
       <w:r>
-        <w:t>dspy.InputField</w:t>
+        <w:t>dspy.OutputField</w:t>
       </w:r>
       <w:proofErr w:type="spellEnd"/>
       <w:proofErr w:type="gramEnd"/>
@@ -1952,597 +2004,1142 @@
     </w:p>
     <w:p>
       <w:r>
+        <w:t xml:space="preserve">    </w:t>
+      </w:r>
+      <w:proofErr w:type="spellStart"/>
+      <w:r>
+        <w:t>desc</w:t>
+      </w:r>
+      <w:proofErr w:type="spellEnd"/>
+      <w:proofErr w:type="gramStart"/>
+      <w:r>
+        <w:t>=(</w:t>
+      </w:r>
+      <w:proofErr w:type="gramEnd"/>
+    </w:p>
+    <w:p>
+      <w:r>
+        <w:t>        "Solicitudes segmentadas y categorizadas por el sistema. "</w:t>
+      </w:r>
+    </w:p>
+    <w:p>
+      <w:r>
+        <w:t>        "El resultado debe ser un único diccionario JSON, donde cada clave tiene el formato '@N'"</w:t>
+      </w:r>
+    </w:p>
+    <w:p>
+      <w:r>
+        <w:t>        "(N es un entero positivo consecutivo comenzando en 1), y cada valor es un diccionario que incluye únicamente las claves: "</w:t>
+      </w:r>
+    </w:p>
+    <w:p>
+      <w:r>
+        <w:t>        "1) 'solicitud': solicitud específica y detallada (</w:t>
+      </w:r>
+      <w:proofErr w:type="spellStart"/>
+      <w:r>
+        <w:t>string</w:t>
+      </w:r>
+      <w:proofErr w:type="spellEnd"/>
+      <w:r>
+        <w:t>), "</w:t>
+      </w:r>
+    </w:p>
+    <w:p>
+      <w:r>
+        <w:t>        "2) 'escenario': escenario de entrada admitido por el sistema asociado a la solicitud (</w:t>
+      </w:r>
+      <w:proofErr w:type="spellStart"/>
+      <w:r>
+        <w:t>string</w:t>
+      </w:r>
+      <w:proofErr w:type="spellEnd"/>
+      <w:r>
+        <w:t>)."</w:t>
+      </w:r>
+    </w:p>
+    <w:p>
+      <w:pPr>
+        <w:rPr>
+          <w:lang w:val="en-US"/>
+        </w:rPr>
+      </w:pPr>
+      <w:r>
         <w:t xml:space="preserve">        </w:t>
       </w:r>
-      <w:proofErr w:type="spellStart"/>
-      <w:r>
-        <w:t>desc</w:t>
-      </w:r>
-      <w:proofErr w:type="spellEnd"/>
+      <w:r>
+        <w:rPr>
+          <w:lang w:val="en-US"/>
+        </w:rPr>
+        <w:t>)</w:t>
+      </w:r>
+    </w:p>
+    <w:p>
+      <w:pPr>
+        <w:rPr>
+          <w:lang w:val="en-US"/>
+        </w:rPr>
+      </w:pPr>
+      <w:r>
+        <w:rPr>
+          <w:lang w:val="en-US"/>
+        </w:rPr>
+        <w:t>    )</w:t>
+      </w:r>
+    </w:p>
+    <w:p>
+      <w:pPr>
+        <w:rPr>
+          <w:lang w:val="en-US"/>
+        </w:rPr>
+      </w:pPr>
+    </w:p>
+    <w:p>
+      <w:pPr>
+        <w:rPr>
+          <w:lang w:val="en-US"/>
+        </w:rPr>
+      </w:pPr>
+      <w:r>
+        <w:rPr>
+          <w:lang w:val="en-US"/>
+        </w:rPr>
+        <w:t xml:space="preserve">    </w:t>
+      </w:r>
+      <w:proofErr w:type="spellStart"/>
+      <w:r>
+        <w:rPr>
+          <w:lang w:val="en-US"/>
+        </w:rPr>
+        <w:t>notas</w:t>
+      </w:r>
+      <w:proofErr w:type="spellEnd"/>
+      <w:r>
+        <w:rPr>
+          <w:lang w:val="en-US"/>
+        </w:rPr>
+        <w:t xml:space="preserve">: str = </w:t>
+      </w:r>
+      <w:proofErr w:type="spellStart"/>
       <w:proofErr w:type="gramStart"/>
       <w:r>
+        <w:rPr>
+          <w:lang w:val="en-US"/>
+        </w:rPr>
+        <w:t>dspy.OutputField</w:t>
+      </w:r>
+      <w:proofErr w:type="spellEnd"/>
+      <w:proofErr w:type="gramEnd"/>
+      <w:r>
+        <w:rPr>
+          <w:lang w:val="en-US"/>
+        </w:rPr>
+        <w:t>(</w:t>
+      </w:r>
+    </w:p>
+    <w:p>
+      <w:pPr>
+        <w:rPr>
+          <w:lang w:val="en-US"/>
+        </w:rPr>
+      </w:pPr>
+      <w:r>
+        <w:rPr>
+          <w:lang w:val="en-US"/>
+        </w:rPr>
+        <w:t>    desc</w:t>
+      </w:r>
+      <w:proofErr w:type="gramStart"/>
+      <w:r>
+        <w:rPr>
+          <w:lang w:val="en-US"/>
+        </w:rPr>
         <w:t>=(</w:t>
       </w:r>
       <w:proofErr w:type="gramEnd"/>
     </w:p>
     <w:p>
       <w:r>
-        <w:t>            "Escenarios estructurados admitidos por el sistema."</w:t>
-      </w:r>
-    </w:p>
-    <w:p>
-      <w:r>
-        <w:t>        )</w:t>
-      </w:r>
-    </w:p>
-    <w:p>
-      <w:r>
-        <w:t xml:space="preserve">    )   </w:t>
+        <w:rPr>
+          <w:lang w:val="en-US"/>
+        </w:rPr>
+        <w:t xml:space="preserve">        </w:t>
+      </w:r>
+      <w:r>
+        <w:t xml:space="preserve">"Contenido del </w:t>
+      </w:r>
+      <w:proofErr w:type="spellStart"/>
+      <w:r>
+        <w:t>prompt</w:t>
+      </w:r>
+      <w:proofErr w:type="spellEnd"/>
+      <w:r>
+        <w:t xml:space="preserve"> del usuario que no constituye una solicitud, "</w:t>
+      </w:r>
+    </w:p>
+    <w:p>
+      <w:r>
+        <w:t>        "pero que aporta contexto narrativo, aclaraciones implícitas o "</w:t>
+      </w:r>
+    </w:p>
+    <w:p>
+      <w:r>
+        <w:t>        "información irrelevante para la formulación de acciones. "</w:t>
+      </w:r>
+    </w:p>
+    <w:p>
+      <w:r>
+        <w:t>        "Incluye comentarios personales, explicaciones circunstanciales, "</w:t>
+      </w:r>
+    </w:p>
+    <w:p>
+      <w:r>
+        <w:t>        "justificaciones o menciones que no expresan una intención operativa "</w:t>
+      </w:r>
+    </w:p>
+    <w:p>
+      <w:r>
+        <w:t>        "ni deben ser interpretadas como solicitudes ni clasificadas dentro "</w:t>
+      </w:r>
+    </w:p>
+    <w:p>
+      <w:r>
+        <w:t>        "de los escenarios de entrada."</w:t>
+      </w:r>
+    </w:p>
+    <w:p>
+      <w:r>
+        <w:t>    )</w:t>
+      </w:r>
+    </w:p>
+    <w:p>
+      <w:r>
+        <w:t>)</w:t>
       </w:r>
     </w:p>
     <w:p/>
     <w:p>
-      <w:r>
-        <w:t xml:space="preserve">    </w:t>
-      </w:r>
-      <w:proofErr w:type="spellStart"/>
-      <w:r>
-        <w:t>solicitudes_categorizadas</w:t>
-      </w:r>
-      <w:proofErr w:type="spellEnd"/>
-      <w:r>
-        <w:t xml:space="preserve">: </w:t>
-      </w:r>
-      <w:proofErr w:type="spellStart"/>
-      <w:r>
-        <w:t>dict</w:t>
-      </w:r>
-      <w:proofErr w:type="spellEnd"/>
-      <w:r>
-        <w:t xml:space="preserve"> = </w:t>
+      <w:pPr>
+        <w:pStyle w:val="Ttulo3"/>
+      </w:pPr>
+      <w:r>
+        <w:t>Resultado llama 3.1 8b (Local)</w:t>
+      </w:r>
+    </w:p>
+    <w:p>
+      <w:pPr>
+        <w:rPr>
+          <w:b/>
+          <w:bCs/>
+        </w:rPr>
+      </w:pPr>
+      <w:r>
+        <w:rPr>
+          <w:b/>
+          <w:bCs/>
+        </w:rPr>
+        <w:t>Las peticiones categorizadas fueron:</w:t>
+      </w:r>
+    </w:p>
+    <w:p>
+      <w:r>
+        <w:t>{'@1': {'solicitud': 'Consumo de nevera ayer por la noche', 'escenario': '</w:t>
+      </w:r>
+      <w:proofErr w:type="spellStart"/>
+      <w:r>
+        <w:t>consumo_basico</w:t>
+      </w:r>
+      <w:proofErr w:type="spellEnd"/>
+      <w:r>
+        <w:t>'}, '@2': {'solicitud': 'Consumo de lavadora el sábado pasado en la mañana', 'escenario': '</w:t>
+      </w:r>
+      <w:proofErr w:type="spellStart"/>
+      <w:r>
+        <w:t>consumo_basico</w:t>
+      </w:r>
+      <w:proofErr w:type="spellEnd"/>
+      <w:r>
+        <w:t>'}, '@3': {'solicitud': 'Comparación de consumo entre nevera y lavadora', 'escenario': '</w:t>
+      </w:r>
+      <w:proofErr w:type="spellStart"/>
+      <w:r>
+        <w:t>comparacion_consumos</w:t>
+      </w:r>
+      <w:proofErr w:type="spellEnd"/>
+      <w:r>
+        <w:t>'}, '@4': {'solicitud': 'Consumo total de todos los dispositivos en el año 2024', 'escenario': '</w:t>
+      </w:r>
+      <w:proofErr w:type="spellStart"/>
+      <w:r>
+        <w:t>consumo_basico</w:t>
+      </w:r>
+      <w:proofErr w:type="spellEnd"/>
+      <w:r>
+        <w:t>'}}</w:t>
+      </w:r>
+    </w:p>
+    <w:p>
+      <w:pPr>
+        <w:rPr>
+          <w:b/>
+          <w:bCs/>
+        </w:rPr>
+      </w:pPr>
+      <w:r>
+        <w:rPr>
+          <w:b/>
+          <w:bCs/>
+        </w:rPr>
+        <w:t>Las notas tomadas fueron:</w:t>
+      </w:r>
+    </w:p>
+    <w:p>
+      <w:r>
+        <w:t>La comparación entre consumo de nevera y lavadora se realizará considerando solo estos dos días. El usuario también pidió que se incluyan gráficas para visualizar los consumos totales del año 2024.</w:t>
+      </w:r>
+    </w:p>
+    <w:p>
+      <w:pPr>
+        <w:pStyle w:val="Ttulo3"/>
+      </w:pPr>
+      <w:r>
+        <w:t xml:space="preserve">Resultado </w:t>
+      </w:r>
+      <w:proofErr w:type="spellStart"/>
+      <w:r>
+        <w:t>deepseek</w:t>
+      </w:r>
+      <w:proofErr w:type="spellEnd"/>
+      <w:r>
+        <w:t xml:space="preserve"> r1 8b (Local)</w:t>
+      </w:r>
+    </w:p>
+    <w:p>
+      <w:pPr>
+        <w:rPr>
+          <w:b/>
+          <w:bCs/>
+        </w:rPr>
+      </w:pPr>
+      <w:r>
+        <w:rPr>
+          <w:b/>
+          <w:bCs/>
+        </w:rPr>
+        <w:t>Las peticiones categorizadas fueron:</w:t>
+      </w:r>
+    </w:p>
+    <w:p>
+      <w:r>
+        <w:t>{'@1': {'solicitud': 'Cuánto consumió mi nevera ayer por la noche y cuánto consumió mi lavadora el sábado pasado en la mañana.', 'escenario': '</w:t>
+      </w:r>
+      <w:proofErr w:type="spellStart"/>
+      <w:r>
+        <w:t>consumo_basico</w:t>
+      </w:r>
+      <w:proofErr w:type="spellEnd"/>
+      <w:r>
+        <w:t>'}, '@2': {'solicitud': 'Comparación de los consumos de la nevera y la lavadora entre ayer y el sábado pasado.', 'escenario': '</w:t>
+      </w:r>
+      <w:proofErr w:type="spellStart"/>
+      <w:r>
+        <w:t>comparacion_consumos</w:t>
+      </w:r>
+      <w:proofErr w:type="spellEnd"/>
+      <w:r>
+        <w:t>'}, '@3': {'solicitud': 'Resumen anual del consumo energético de todos los dispositivos en el año 2024 con formato gráfico.', 'escenario': '</w:t>
+      </w:r>
+      <w:proofErr w:type="spellStart"/>
+      <w:r>
+        <w:t>consumo_basico</w:t>
+      </w:r>
+      <w:proofErr w:type="spellEnd"/>
+      <w:r>
+        <w:t>'}}</w:t>
+      </w:r>
+    </w:p>
+    <w:p>
+      <w:pPr>
+        <w:rPr>
+          <w:b/>
+          <w:bCs/>
+        </w:rPr>
+      </w:pPr>
+      <w:r>
+        <w:rPr>
+          <w:b/>
+          <w:bCs/>
+        </w:rPr>
+        <w:t>Las notas tomadas fueron:</w:t>
+      </w:r>
+    </w:p>
+    <w:p>
+      <w:r>
+        <w:t>La experiencia de ver que el celular se descargó mientras revisaba los consumos puede haber influido en la decisión de querer obtener una comparación, pero no constituye una solicitud operativa.</w:t>
+      </w:r>
+    </w:p>
+    <w:p>
+      <w:pPr>
+        <w:pStyle w:val="Ttulo3"/>
+      </w:pPr>
+      <w:r>
+        <w:t>Resultado Gemma 7b (Local)</w:t>
+      </w:r>
+    </w:p>
+    <w:p>
+      <w:pPr>
+        <w:rPr>
+          <w:b/>
+          <w:bCs/>
+        </w:rPr>
+      </w:pPr>
+      <w:r>
+        <w:rPr>
+          <w:b/>
+          <w:bCs/>
+        </w:rPr>
+        <w:t>Las peticiones categorizadas fueron:</w:t>
+      </w:r>
+    </w:p>
+    <w:p>
+      <w:r>
+        <w:t>{'1': {'solicitud': 'Consumir de la nevera ayer por la noche y de la lavadora el sábado pasado por la mañana.', 'escenario': '</w:t>
+      </w:r>
+      <w:proofErr w:type="spellStart"/>
+      <w:r>
+        <w:t>consumo_basico</w:t>
+      </w:r>
+      <w:proofErr w:type="spellEnd"/>
+      <w:r>
+        <w:t>'}, '2': {'solicitud': 'Comparar el consumo de energía entre la nevera y la lavadora en los dos días mencionados.', 'escenario': '</w:t>
+      </w:r>
+      <w:proofErr w:type="spellStart"/>
+      <w:r>
+        <w:t>comparacion_consumos</w:t>
+      </w:r>
+      <w:proofErr w:type="spellEnd"/>
+      <w:r>
+        <w:t>'}, '3': {'solicitud': 'Identificar picos de consumo o tendencias sostenidas en los consumos de los dos días mencionados.', 'escenario': '</w:t>
+      </w:r>
+      <w:proofErr w:type="spellStart"/>
+      <w:r>
+        <w:t>deteccion_anomalias_tendencias</w:t>
+      </w:r>
+      <w:proofErr w:type="spellEnd"/>
+      <w:r>
+        <w:t>'}, '4': {'solicitud': 'Establecer el consumo total de energía de todos los dispositivos en el año 2024.', 'escenario': '</w:t>
+      </w:r>
+      <w:proofErr w:type="spellStart"/>
+      <w:r>
+        <w:t>prediccion_estimacion</w:t>
+      </w:r>
+      <w:proofErr w:type="spellEnd"/>
+      <w:r>
+        <w:t>'}}</w:t>
+      </w:r>
+    </w:p>
+    <w:p>
+      <w:pPr>
+        <w:rPr>
+          <w:b/>
+          <w:bCs/>
+        </w:rPr>
+      </w:pPr>
+      <w:r>
+        <w:rPr>
+          <w:b/>
+          <w:bCs/>
+        </w:rPr>
+        <w:t>Las notas tomadas fueron:</w:t>
+      </w:r>
+    </w:p>
+    <w:p>
+      <w:r>
+        <w:t>El usuario también solicita información sobre el consumo de todos los dispositivos en el año 2024, y desea ver gráficas. Sin embargo, estas solicitudes no se pueden categorizar como una sola solicitud específica o escenario de entrada admitido por el sistema.</w:t>
+      </w:r>
+    </w:p>
+    <w:p>
+      <w:pPr>
+        <w:pStyle w:val="Ttulo3"/>
+      </w:pPr>
+      <w:r>
+        <w:t>Resultado Mistral 7b (Local)</w:t>
+      </w:r>
+    </w:p>
+    <w:p>
+      <w:pPr>
+        <w:rPr>
+          <w:b/>
+          <w:bCs/>
+        </w:rPr>
+      </w:pPr>
+      <w:r>
+        <w:rPr>
+          <w:b/>
+          <w:bCs/>
+        </w:rPr>
+        <w:t>Las peticiones categorizadas fueron:</w:t>
+      </w:r>
+    </w:p>
+    <w:p>
+      <w:r>
+        <w:t>{'@1': {'solicitud': 'Consumo de la nevera el día anterior por la noche', 'escenario': '</w:t>
+      </w:r>
+      <w:proofErr w:type="spellStart"/>
+      <w:r>
+        <w:t>consumo_basico</w:t>
+      </w:r>
+      <w:proofErr w:type="spellEnd"/>
+      <w:r>
+        <w:t>'}, '@2': {'solicitud': 'Consumo de la lavadora el sábado pasado en la mañana', 'escenario': '</w:t>
+      </w:r>
+      <w:proofErr w:type="spellStart"/>
+      <w:r>
+        <w:t>consumo_basico</w:t>
+      </w:r>
+      <w:proofErr w:type="spellEnd"/>
+      <w:r>
+        <w:t>'}, '@3': {'solicitud': 'Comparación del consumo entre nevera y lavadora', 'escenario': '</w:t>
+      </w:r>
+      <w:proofErr w:type="spellStart"/>
+      <w:r>
+        <w:t>comparacion_consumos</w:t>
+      </w:r>
+      <w:proofErr w:type="spellEnd"/>
+      <w:r>
+        <w:t>'}}</w:t>
+      </w:r>
+    </w:p>
+    <w:p>
+      <w:pPr>
+        <w:rPr>
+          <w:b/>
+          <w:bCs/>
+        </w:rPr>
+      </w:pPr>
+      <w:r>
+        <w:rPr>
+          <w:b/>
+          <w:bCs/>
+        </w:rPr>
+        <w:t>Las notas tomadas fueron:</w:t>
+      </w:r>
+    </w:p>
+    <w:p>
+      <w:r>
+        <w:t>El usuario también solicita información sobre el consumo de todos los dispositivos en el año 2024, y desea ver gráficas. Sin embargo, estas solicitudes no se pueden categorizar como una sola solicitud específica o escenario de entrada admitido por el sistema.</w:t>
+      </w:r>
+    </w:p>
+    <w:p>
+      <w:pPr>
+        <w:pStyle w:val="Ttulo3"/>
+        <w:rPr>
+          <w:lang w:val="en-US"/>
+        </w:rPr>
+      </w:pPr>
+      <w:proofErr w:type="spellStart"/>
+      <w:r>
+        <w:rPr>
+          <w:lang w:val="en-US"/>
+        </w:rPr>
+        <w:t>Resultado</w:t>
+      </w:r>
+      <w:proofErr w:type="spellEnd"/>
+      <w:r>
+        <w:rPr>
+          <w:lang w:val="en-US"/>
+        </w:rPr>
+        <w:t xml:space="preserve"> Qwen3 4b (Local)</w:t>
+      </w:r>
+    </w:p>
+    <w:p>
+      <w:pPr>
+        <w:rPr>
+          <w:lang w:val="en-US"/>
+        </w:rPr>
+      </w:pPr>
+      <w:r>
+        <w:rPr>
+          <w:lang w:val="en-US"/>
+        </w:rPr>
+        <w:t xml:space="preserve">2025/12/20 18:08:49 WARNING </w:t>
       </w:r>
       <w:proofErr w:type="spellStart"/>
       <w:proofErr w:type="gramStart"/>
       <w:r>
-        <w:t>dspy.OutputField</w:t>
-      </w:r>
-      <w:proofErr w:type="spellEnd"/>
+        <w:rPr>
+          <w:lang w:val="en-US"/>
+        </w:rPr>
+        <w:t>dspy.adapters</w:t>
+      </w:r>
       <w:proofErr w:type="gramEnd"/>
       <w:r>
+        <w:rPr>
+          <w:lang w:val="en-US"/>
+        </w:rPr>
+        <w:t>.json_adapter</w:t>
+      </w:r>
+      <w:proofErr w:type="spellEnd"/>
+      <w:r>
+        <w:rPr>
+          <w:lang w:val="en-US"/>
+        </w:rPr>
+        <w:t>: Failed to use structured output format, falling back to JSON mode.</w:t>
+      </w:r>
+    </w:p>
+    <w:p>
+      <w:r>
+        <w:t xml:space="preserve">El modelo genera razonamiento en texto libre y fragmentos de JSON inválido, sin cumplir el esquema exigido por el sistema. La respuesta no es </w:t>
+      </w:r>
+      <w:proofErr w:type="spellStart"/>
+      <w:r>
+        <w:t>parseable</w:t>
+      </w:r>
+      <w:proofErr w:type="spellEnd"/>
+      <w:r>
+        <w:t xml:space="preserve"> ni usable por el pipeline</w:t>
+      </w:r>
+      <w:r>
+        <w:t>. También parece confundirse con el razonamiento interno del modelo.</w:t>
+      </w:r>
+    </w:p>
+    <w:p>
+      <w:pPr>
+        <w:pStyle w:val="Ttulo3"/>
+      </w:pPr>
+      <w:r>
+        <w:t xml:space="preserve">Resultado </w:t>
+      </w:r>
+      <w:r>
+        <w:t xml:space="preserve">Llama 3.3 70b </w:t>
+      </w:r>
+      <w:r>
         <w:t>(</w:t>
       </w:r>
-    </w:p>
-    <w:p>
-      <w:r>
-        <w:t xml:space="preserve">    </w:t>
-      </w:r>
-      <w:proofErr w:type="spellStart"/>
-      <w:r>
-        <w:t>desc</w:t>
-      </w:r>
-      <w:proofErr w:type="spellEnd"/>
+      <w:proofErr w:type="spellStart"/>
+      <w:r>
+        <w:t>OpenRouter</w:t>
+      </w:r>
+      <w:proofErr w:type="spellEnd"/>
+      <w:r>
+        <w:t>)</w:t>
+      </w:r>
+    </w:p>
+    <w:p>
+      <w:pPr>
+        <w:rPr>
+          <w:b/>
+          <w:bCs/>
+        </w:rPr>
+      </w:pPr>
+      <w:r>
+        <w:rPr>
+          <w:b/>
+          <w:bCs/>
+        </w:rPr>
+        <w:t>Las peticiones categorizadas fueron:</w:t>
+      </w:r>
+    </w:p>
+    <w:p>
+      <w:r>
+        <w:t>{'@1': {'solicitud': 'consumo de la nevera ayer por la noche', 'escenario': '</w:t>
+      </w:r>
+      <w:proofErr w:type="spellStart"/>
+      <w:r>
+        <w:t>consumo_basico</w:t>
+      </w:r>
+      <w:proofErr w:type="spellEnd"/>
+      <w:r>
+        <w:t>'}, '@2': {'solicitud': 'consumo de la lavadora el sábado pasado en la mañana', 'escenario': '</w:t>
+      </w:r>
+      <w:proofErr w:type="spellStart"/>
+      <w:r>
+        <w:t>consumo_basico</w:t>
+      </w:r>
+      <w:proofErr w:type="spellEnd"/>
+      <w:r>
+        <w:t>'}, '@3': {'solicitud': 'comparación de consumos entre la nevera y la lavadora', 'escenario': '</w:t>
+      </w:r>
+      <w:proofErr w:type="spellStart"/>
+      <w:r>
+        <w:t>comparacion_consumos</w:t>
+      </w:r>
+      <w:proofErr w:type="spellEnd"/>
+      <w:r>
+        <w:t>'}, '@4': {'solicitud': 'consumo total de todos los dispositivos en el año 2024', 'escenario': '</w:t>
+      </w:r>
+      <w:proofErr w:type="spellStart"/>
+      <w:r>
+        <w:t>consumo_basico</w:t>
+      </w:r>
+      <w:proofErr w:type="spellEnd"/>
+      <w:r>
+        <w:t>'}}</w:t>
+      </w:r>
+    </w:p>
+    <w:p>
+      <w:pPr>
+        <w:rPr>
+          <w:b/>
+          <w:bCs/>
+        </w:rPr>
+      </w:pPr>
+      <w:r>
+        <w:rPr>
+          <w:b/>
+          <w:bCs/>
+        </w:rPr>
+        <w:t>Las notas tomadas fueron:</w:t>
+      </w:r>
+    </w:p>
+    <w:p>
+      <w:r>
+        <w:t>El usuario menciona que se le descargó el celular y no se paró a buscar el cargador, y también menciona que su papá pidió ver gráficas de todo lo que se pueda. Estos comentarios no están relacionados con las solicitudes de consumo energético y se consideran información adicional o contexto narrativo.</w:t>
+      </w:r>
+    </w:p>
+    <w:p>
+      <w:pPr>
+        <w:pStyle w:val="Ttulo3"/>
+      </w:pPr>
+      <w:r>
+        <w:t xml:space="preserve">Resultado </w:t>
+      </w:r>
+      <w:r>
+        <w:t xml:space="preserve">Gemini 2.0 Flash </w:t>
+      </w:r>
+      <w:r>
+        <w:t>experimental (</w:t>
+      </w:r>
+      <w:proofErr w:type="spellStart"/>
+      <w:r>
+        <w:t>OpenRouter</w:t>
+      </w:r>
+      <w:proofErr w:type="spellEnd"/>
+      <w:r>
+        <w:t>)</w:t>
+      </w:r>
+    </w:p>
+    <w:p>
+      <w:pPr>
+        <w:rPr>
+          <w:b/>
+          <w:bCs/>
+        </w:rPr>
+      </w:pPr>
+      <w:r>
+        <w:rPr>
+          <w:b/>
+          <w:bCs/>
+        </w:rPr>
+        <w:t>Las peticiones categorizadas fueron:</w:t>
+      </w:r>
+    </w:p>
+    <w:p>
+      <w:r>
+        <w:t>{'@1': {'solicitud': 'Determinar el consumo energético de la nevera durante la noche de ayer.', 'escenario': '</w:t>
+      </w:r>
+      <w:proofErr w:type="spellStart"/>
+      <w:r>
+        <w:t>consumo_basico</w:t>
+      </w:r>
+      <w:proofErr w:type="spellEnd"/>
+      <w:r>
+        <w:t>'}, '@2': {'solicitud': 'Determinar el consumo energético de la lavadora durante la mañana del sábado pasado.', 'escenario': '</w:t>
+      </w:r>
+      <w:proofErr w:type="spellStart"/>
+      <w:r>
+        <w:t>consumo_basico</w:t>
+      </w:r>
+      <w:proofErr w:type="spellEnd"/>
+      <w:r>
+        <w:t>'}, '@3': {'solicitud': 'Comparar el consumo energético de la nevera (noche de ayer) con el de la lavadora (mañana del sábado pasado) para determinar cuál consumió más energía.', 'escenario': '</w:t>
+      </w:r>
+      <w:proofErr w:type="spellStart"/>
+      <w:r>
+        <w:t>comparacion_consumos</w:t>
+      </w:r>
+      <w:proofErr w:type="spellEnd"/>
+      <w:r>
+        <w:t>'}, '@4': {'solicitud': 'Mostrar el consumo de todos los dispositivos en el año 2024.', 'escenario': '</w:t>
+      </w:r>
+      <w:proofErr w:type="spellStart"/>
+      <w:r>
+        <w:t>consumo_basico</w:t>
+      </w:r>
+      <w:proofErr w:type="spellEnd"/>
+      <w:r>
+        <w:t>'}, '@5': {'solicitud': 'Generar representaciones gráficas del consumo energético de los dispositivos en el año 2024.', 'escenario': '</w:t>
+      </w:r>
+      <w:proofErr w:type="spellStart"/>
+      <w:r>
+        <w:t>consumo_basico</w:t>
+      </w:r>
+      <w:proofErr w:type="spellEnd"/>
+      <w:r>
+        <w:t>'}}</w:t>
+      </w:r>
+    </w:p>
+    <w:p>
+      <w:pPr>
+        <w:rPr>
+          <w:b/>
+          <w:bCs/>
+        </w:rPr>
+      </w:pPr>
+      <w:r>
+        <w:rPr>
+          <w:b/>
+          <w:bCs/>
+        </w:rPr>
+        <w:t>Las notas tomadas fueron:</w:t>
+      </w:r>
+    </w:p>
+    <w:p>
+      <w:r>
+        <w:t>"El comentario sobre la descarga del celular y la pereza de buscar el cargador es irrelevante para las solicitudes de consumo energético."</w:t>
+      </w:r>
+    </w:p>
+    <w:p>
+      <w:pPr>
+        <w:pStyle w:val="Ttulo3"/>
+      </w:pPr>
+      <w:r>
+        <w:t xml:space="preserve">Resultado </w:t>
+      </w:r>
+      <w:r>
+        <w:t>Mistral Devstral2</w:t>
+      </w:r>
+      <w:r>
+        <w:t xml:space="preserve"> </w:t>
+      </w:r>
+      <w:r>
+        <w:t xml:space="preserve">123b </w:t>
+      </w:r>
+      <w:r>
+        <w:t>(</w:t>
+      </w:r>
+      <w:proofErr w:type="spellStart"/>
+      <w:r>
+        <w:t>OpenRouter</w:t>
+      </w:r>
+      <w:proofErr w:type="spellEnd"/>
+      <w:r>
+        <w:t>)</w:t>
+      </w:r>
+    </w:p>
+    <w:p>
+      <w:pPr>
+        <w:rPr>
+          <w:b/>
+          <w:bCs/>
+        </w:rPr>
+      </w:pPr>
+      <w:r>
+        <w:rPr>
+          <w:b/>
+          <w:bCs/>
+        </w:rPr>
+        <w:t>Las peticiones categorizadas fueron:</w:t>
+      </w:r>
+    </w:p>
+    <w:p>
+      <w:r>
+        <w:t>{'@1': {'solicitud': 'Necesito saber cuánto consumió mi nevera ayer por la noche', 'escenario': '</w:t>
+      </w:r>
+      <w:proofErr w:type="spellStart"/>
+      <w:r>
+        <w:t>consumo_basico</w:t>
+      </w:r>
+      <w:proofErr w:type="spellEnd"/>
+      <w:r>
+        <w:t>'}, '@2': {'solicitud': 'cuánto consumió mi lavadora el sábado pasado en la mañana', 'escenario': '</w:t>
+      </w:r>
+      <w:proofErr w:type="spellStart"/>
+      <w:r>
+        <w:t>consumo_basico</w:t>
+      </w:r>
+      <w:proofErr w:type="spellEnd"/>
+      <w:r>
+        <w:t>'}, '@3': {'solicitud': 'quiero que me digas si entre esos dos días cuál gastó más energía', 'escenario': '</w:t>
+      </w:r>
+      <w:proofErr w:type="spellStart"/>
+      <w:r>
+        <w:t>comparacion_consumos</w:t>
+      </w:r>
+      <w:proofErr w:type="spellEnd"/>
+      <w:r>
+        <w:t>'}, '@4': {'solicitud': 'cuánto fue el consumo de todos los dispositivos en el año 2024', 'escenario': '</w:t>
+      </w:r>
+      <w:proofErr w:type="spellStart"/>
+      <w:r>
+        <w:t>consumo_basico</w:t>
+      </w:r>
+      <w:proofErr w:type="spellEnd"/>
+      <w:r>
+        <w:t>'}, '@5': {'solicitud': 'quiero ver gráficas de todo lo que se pueda', 'escenario': '</w:t>
+      </w:r>
+      <w:proofErr w:type="spellStart"/>
+      <w:r>
+        <w:t>consumo_basico</w:t>
+      </w:r>
+      <w:proofErr w:type="spellEnd"/>
+      <w:r>
+        <w:t>'}}</w:t>
+      </w:r>
+    </w:p>
+    <w:p>
+      <w:pPr>
+        <w:rPr>
+          <w:b/>
+          <w:bCs/>
+        </w:rPr>
+      </w:pPr>
+      <w:r>
+        <w:rPr>
+          <w:b/>
+          <w:bCs/>
+        </w:rPr>
+        <w:t>Las notas tomadas fueron:</w:t>
+      </w:r>
+    </w:p>
+    <w:p>
+      <w:r>
+        <w:t>"Además, mientras miraba esos consumos se me descargó el celular y me dio mucha pereza pararme a buscar el cargador, pero igual quiero la comparación. Papá también pidió que le dijeras..."</w:t>
+      </w:r>
+    </w:p>
+    <w:p>
+      <w:pPr>
+        <w:pStyle w:val="Ttulo3"/>
+      </w:pPr>
+      <w:r>
+        <w:t xml:space="preserve">Resultado </w:t>
+      </w:r>
+      <w:r>
+        <w:t xml:space="preserve">Xiaomi MimoV2 Flash 15b 309b </w:t>
+      </w:r>
+      <w:r>
+        <w:t>(</w:t>
+      </w:r>
+      <w:proofErr w:type="spellStart"/>
+      <w:r>
+        <w:t>OpenRouter</w:t>
+      </w:r>
+      <w:proofErr w:type="spellEnd"/>
+      <w:r>
+        <w:t>)</w:t>
+      </w:r>
+    </w:p>
+    <w:p>
+      <w:pPr>
+        <w:rPr>
+          <w:b/>
+          <w:bCs/>
+        </w:rPr>
+      </w:pPr>
+      <w:r>
+        <w:rPr>
+          <w:b/>
+          <w:bCs/>
+        </w:rPr>
+        <w:t>Las peticiones categorizadas fueron:</w:t>
+      </w:r>
+    </w:p>
+    <w:p>
+      <w:pPr>
+        <w:rPr>
+          <w:u w:val="single"/>
+        </w:rPr>
+      </w:pPr>
+      <w:r>
+        <w:t>{'@1': {'solicitud': 'Obtener el consumo energético de la nevera durante la noche del día anterior al momento de la consulta.', 'escenario': '</w:t>
+      </w:r>
+      <w:proofErr w:type="spellStart"/>
+      <w:r>
+        <w:t>consumo_basico</w:t>
+      </w:r>
+      <w:proofErr w:type="spellEnd"/>
+      <w:r>
+        <w:t>'}, '@2': {'solicitud': 'Obtener el consumo energético de la lavadora durante la mañana del sábado anterior al momento de la consulta.', 'escenario': '</w:t>
+      </w:r>
+      <w:proofErr w:type="spellStart"/>
+      <w:r>
+        <w:t>consumo_basico</w:t>
+      </w:r>
+      <w:proofErr w:type="spellEnd"/>
+      <w:r>
+        <w:t>'}, '@3': {'solicitud': 'Comparar el consumo energético de la nevera (noche anterior) y la lavadora (sábado por la mañana) para determinar cuál gastó más energía.', 'escenario': '</w:t>
+      </w:r>
+      <w:proofErr w:type="spellStart"/>
+      <w:r>
+        <w:t>comparacion_consumos</w:t>
+      </w:r>
+      <w:proofErr w:type="spellEnd"/>
+      <w:r>
+        <w:t>'}, '@4': {'solicitud': 'Obtener el consumo energético total de todos los dispositivos del hogar para el año 2024.', 'escenario': '</w:t>
+      </w:r>
+      <w:proofErr w:type="spellStart"/>
+      <w:r>
+        <w:t>consumo_basico</w:t>
+      </w:r>
+      <w:proofErr w:type="spellEnd"/>
+      <w:r>
+        <w:t>'}, '@5': {'solicitud': 'Generar visualizaciones y gráficas de los datos de consumo energético disponibles para el año 2024.', 'escenario': '</w:t>
+      </w:r>
+      <w:proofErr w:type="spellStart"/>
+      <w:r>
+        <w:t>consumo_basico</w:t>
+      </w:r>
+      <w:proofErr w:type="spellEnd"/>
+      <w:r>
+        <w:t>'}}</w:t>
+      </w:r>
+    </w:p>
+    <w:p>
+      <w:pPr>
+        <w:rPr>
+          <w:b/>
+          <w:bCs/>
+        </w:rPr>
+      </w:pPr>
+      <w:r>
+        <w:rPr>
+          <w:b/>
+          <w:bCs/>
+        </w:rPr>
+        <w:t>Las notas tomadas fueron:</w:t>
+      </w:r>
+    </w:p>
+    <w:p>
+      <w:r>
+        <w:t>Mientras miraba los consumos se le descargó el celular y le dio mucha pereza pararse a buscar el cargador. Papá también pidió la información de consumo para el año 2024.</w:t>
+      </w:r>
+    </w:p>
+    <w:p>
+      <w:pPr>
+        <w:pStyle w:val="Ttulo3"/>
+      </w:pPr>
+      <w:r>
+        <w:t xml:space="preserve">Resultado </w:t>
+      </w:r>
+      <w:proofErr w:type="spellStart"/>
+      <w:r>
+        <w:t>Qwen</w:t>
+      </w:r>
+      <w:proofErr w:type="spellEnd"/>
+      <w:r>
+        <w:t xml:space="preserve"> 3 </w:t>
+      </w:r>
+      <w:proofErr w:type="spellStart"/>
+      <w:r>
+        <w:t>Coder</w:t>
+      </w:r>
+      <w:proofErr w:type="spellEnd"/>
+      <w:r>
+        <w:t xml:space="preserve"> 35b 480b </w:t>
+      </w:r>
+      <w:r>
+        <w:t>(</w:t>
+      </w:r>
+      <w:proofErr w:type="spellStart"/>
+      <w:r>
+        <w:t>OpenRouter</w:t>
+      </w:r>
+      <w:proofErr w:type="spellEnd"/>
+      <w:r>
+        <w:t>)</w:t>
+      </w:r>
+    </w:p>
+    <w:p>
+      <w:pPr>
+        <w:rPr>
+          <w:b/>
+          <w:bCs/>
+        </w:rPr>
+      </w:pPr>
+      <w:r>
+        <w:rPr>
+          <w:b/>
+          <w:bCs/>
+        </w:rPr>
+        <w:t>Las peticiones categorizadas fueron:</w:t>
+      </w:r>
+    </w:p>
+    <w:p>
+      <w:r>
+        <w:t>{'@1': {'solicitud': 'Obtener el consumo energético de la nevera durante la noche del día anterior.', 'escenario': '</w:t>
+      </w:r>
+      <w:proofErr w:type="spellStart"/>
+      <w:r>
+        <w:t>consumo_basico</w:t>
+      </w:r>
+      <w:proofErr w:type="spellEnd"/>
+      <w:r>
+        <w:t>'}, '@2': {'solicitud': 'Obtener el consumo energético de la lavadora durante la mañana del sábado pasado.', 'escenario': '</w:t>
+      </w:r>
+      <w:proofErr w:type="spellStart"/>
+      <w:r>
+        <w:t>consumo_basico</w:t>
+      </w:r>
+      <w:proofErr w:type="spellEnd"/>
+      <w:r>
+        <w:t>'}, '@3': {'solicitud': 'Comparar el consumo energético entre la nevera (ayer por la noche) y la lavadora (sábado pasado en la mañana) para determinar cuál gastó más energía.', 'escenario': '</w:t>
+      </w:r>
+      <w:proofErr w:type="spellStart"/>
+      <w:r>
+        <w:t>comparacion_consumos</w:t>
+      </w:r>
+      <w:proofErr w:type="spellEnd"/>
+      <w:r>
+        <w:t>'}, '@4': {'solicitud': 'Obtener el consumo energético total de todos los dispositivos del hogar durante el año 2024.', 'escenario': '</w:t>
+      </w:r>
+      <w:proofErr w:type="spellStart"/>
+      <w:r>
+        <w:t>consumo_basico</w:t>
+      </w:r>
+      <w:proofErr w:type="spellEnd"/>
+      <w:r>
+        <w:t>'}, '@5': {'solicitud': 'Generar gráficas del consumo energético de los dispositivos del hogar para el año 2024.', 'escenario': '</w:t>
+      </w:r>
+      <w:proofErr w:type="spellStart"/>
+      <w:r>
+        <w:t>entrada_inadmisible</w:t>
+      </w:r>
+      <w:proofErr w:type="spellEnd"/>
+      <w:r>
+        <w:t>'}}</w:t>
+      </w:r>
+    </w:p>
+    <w:p>
+      <w:pPr>
+        <w:rPr>
+          <w:b/>
+          <w:bCs/>
+        </w:rPr>
+      </w:pPr>
+      <w:r>
+        <w:rPr>
+          <w:b/>
+          <w:bCs/>
+        </w:rPr>
+        <w:t>Las notas tomadas fueron:</w:t>
+      </w:r>
+    </w:p>
+    <w:p>
+      <w:r>
+        <w:t xml:space="preserve">El usuario menciona que su celular se descargó y le dio pereza buscar el cargador, lo cual no constituye una solicitud operativa. Además, comenta que su papá también hizo una solicitud, lo cual aporta contexto </w:t>
+      </w:r>
       <w:proofErr w:type="gramStart"/>
       <w:r>
-        <w:t>=(</w:t>
+        <w:t>narrativo</w:t>
       </w:r>
       <w:proofErr w:type="gramEnd"/>
-    </w:p>
-    <w:p>
-      <w:r>
-        <w:t>        "Solicitudes segmentadas y categorizadas por el sistema. "</w:t>
-      </w:r>
-    </w:p>
-    <w:p>
-      <w:r>
-        <w:t>        "El resultado debe ser un único diccionario JSON, donde cada clave tiene el formato '@N'"</w:t>
-      </w:r>
-    </w:p>
-    <w:p>
-      <w:r>
-        <w:t>        "(N es un entero positivo consecutivo comenzando en 1), y cada valor es un diccionario que incluye únicamente las claves: "</w:t>
-      </w:r>
-    </w:p>
-    <w:p>
-      <w:r>
-        <w:t>        "1) 'solicitud': solicitud específica y detallada (</w:t>
-      </w:r>
-      <w:proofErr w:type="spellStart"/>
-      <w:r>
-        <w:t>string</w:t>
-      </w:r>
-      <w:proofErr w:type="spellEnd"/>
-      <w:r>
-        <w:t>), "</w:t>
-      </w:r>
-    </w:p>
-    <w:p>
-      <w:r>
-        <w:t>        "2) 'escenario': escenario de entrada admitido por el sistema asociado a la solicitud (</w:t>
-      </w:r>
-      <w:proofErr w:type="spellStart"/>
-      <w:r>
-        <w:t>string</w:t>
-      </w:r>
-      <w:proofErr w:type="spellEnd"/>
-      <w:r>
-        <w:t>)."</w:t>
-      </w:r>
-    </w:p>
-    <w:p>
-      <w:pPr>
-        <w:rPr>
-          <w:lang w:val="en-US"/>
-        </w:rPr>
-      </w:pPr>
-      <w:r>
-        <w:t xml:space="preserve">        </w:t>
-      </w:r>
-      <w:r>
-        <w:rPr>
-          <w:lang w:val="en-US"/>
-        </w:rPr>
-        <w:t>)</w:t>
-      </w:r>
-    </w:p>
-    <w:p>
-      <w:pPr>
-        <w:rPr>
-          <w:lang w:val="en-US"/>
-        </w:rPr>
-      </w:pPr>
-      <w:r>
-        <w:rPr>
-          <w:lang w:val="en-US"/>
-        </w:rPr>
-        <w:t>    )</w:t>
-      </w:r>
-    </w:p>
-    <w:p>
-      <w:pPr>
-        <w:rPr>
-          <w:lang w:val="en-US"/>
-        </w:rPr>
-      </w:pPr>
-    </w:p>
-    <w:p>
-      <w:pPr>
-        <w:rPr>
-          <w:lang w:val="en-US"/>
-        </w:rPr>
-      </w:pPr>
-      <w:r>
-        <w:rPr>
-          <w:lang w:val="en-US"/>
-        </w:rPr>
-        <w:t xml:space="preserve">    </w:t>
-      </w:r>
-      <w:proofErr w:type="spellStart"/>
-      <w:r>
-        <w:rPr>
-          <w:lang w:val="en-US"/>
-        </w:rPr>
-        <w:t>notas</w:t>
-      </w:r>
-      <w:proofErr w:type="spellEnd"/>
-      <w:r>
-        <w:rPr>
-          <w:lang w:val="en-US"/>
-        </w:rPr>
-        <w:t xml:space="preserve">: str = </w:t>
-      </w:r>
-      <w:proofErr w:type="spellStart"/>
-      <w:proofErr w:type="gramStart"/>
-      <w:r>
-        <w:rPr>
-          <w:lang w:val="en-US"/>
-        </w:rPr>
-        <w:t>dspy.OutputField</w:t>
-      </w:r>
-      <w:proofErr w:type="spellEnd"/>
-      <w:proofErr w:type="gramEnd"/>
-      <w:r>
-        <w:rPr>
-          <w:lang w:val="en-US"/>
-        </w:rPr>
-        <w:t>(</w:t>
-      </w:r>
-    </w:p>
-    <w:p>
-      <w:pPr>
-        <w:rPr>
-          <w:lang w:val="en-US"/>
-        </w:rPr>
-      </w:pPr>
-      <w:r>
-        <w:rPr>
-          <w:lang w:val="en-US"/>
-        </w:rPr>
-        <w:t>    desc</w:t>
-      </w:r>
-      <w:proofErr w:type="gramStart"/>
-      <w:r>
-        <w:rPr>
-          <w:lang w:val="en-US"/>
-        </w:rPr>
-        <w:t>=(</w:t>
-      </w:r>
-      <w:proofErr w:type="gramEnd"/>
-    </w:p>
-    <w:p>
-      <w:r>
-        <w:rPr>
-          <w:lang w:val="en-US"/>
-        </w:rPr>
-        <w:t xml:space="preserve">        </w:t>
-      </w:r>
-      <w:r>
-        <w:t xml:space="preserve">"Contenido del </w:t>
-      </w:r>
-      <w:proofErr w:type="spellStart"/>
-      <w:r>
-        <w:t>prompt</w:t>
-      </w:r>
-      <w:proofErr w:type="spellEnd"/>
-      <w:r>
-        <w:t xml:space="preserve"> del usuario que no constituye una solicitud, "</w:t>
-      </w:r>
-    </w:p>
-    <w:p>
-      <w:r>
-        <w:t>        "pero que aporta contexto narrativo, aclaraciones implícitas o "</w:t>
-      </w:r>
-    </w:p>
-    <w:p>
-      <w:r>
-        <w:t>        "información irrelevante para la formulación de acciones. "</w:t>
-      </w:r>
-    </w:p>
-    <w:p>
-      <w:r>
-        <w:t>        "Incluye comentarios personales, explicaciones circunstanciales, "</w:t>
-      </w:r>
-    </w:p>
-    <w:p>
-      <w:r>
-        <w:t>        "justificaciones o menciones que no expresan una intención operativa "</w:t>
-      </w:r>
-    </w:p>
-    <w:p>
-      <w:r>
-        <w:t>        "ni deben ser interpretadas como solicitudes ni clasificadas dentro "</w:t>
-      </w:r>
-    </w:p>
-    <w:p>
-      <w:r>
-        <w:t>        "de los escenarios de entrada."</w:t>
-      </w:r>
-    </w:p>
-    <w:p>
-      <w:r>
-        <w:t>    )</w:t>
-      </w:r>
-    </w:p>
-    <w:p>
-      <w:r>
-        <w:t>)</w:t>
-      </w:r>
-    </w:p>
-    <w:p/>
+      <w:r>
+        <w:t xml:space="preserve"> pero no modifica la estructura de las solicitudes identificadas.</w:t>
+      </w:r>
+    </w:p>
     <w:p>
       <w:pPr>
         <w:pStyle w:val="Ttulo3"/>
-      </w:pPr>
-      <w:r>
-        <w:t>Resultado llama 3.1 8b (Local)</w:t>
-      </w:r>
-    </w:p>
-    <w:p>
-      <w:pPr>
-        <w:rPr>
-          <w:b/>
-          <w:bCs/>
-        </w:rPr>
-      </w:pPr>
-      <w:r>
-        <w:rPr>
-          <w:b/>
-          <w:bCs/>
-        </w:rPr>
-        <w:t>Las peticiones categorizadas fueron:</w:t>
-      </w:r>
-    </w:p>
-    <w:p>
-      <w:r>
-        <w:t>{'@1': {'solicitud': 'Consumo de nevera ayer por la noche', 'escenario': '</w:t>
-      </w:r>
-      <w:proofErr w:type="spellStart"/>
-      <w:r>
-        <w:t>consumo_basico</w:t>
-      </w:r>
-      <w:proofErr w:type="spellEnd"/>
-      <w:r>
-        <w:t>'}, '@2': {'solicitud': 'Consumo de lavadora el sábado pasado en la mañana', 'escenario': '</w:t>
-      </w:r>
-      <w:proofErr w:type="spellStart"/>
-      <w:r>
-        <w:t>consumo_basico</w:t>
-      </w:r>
-      <w:proofErr w:type="spellEnd"/>
-      <w:r>
-        <w:t>'}, '@3': {'solicitud': 'Comparación de consumo entre nevera y lavadora', 'escenario': '</w:t>
-      </w:r>
-      <w:proofErr w:type="spellStart"/>
-      <w:r>
-        <w:t>comparacion_consumos</w:t>
-      </w:r>
-      <w:proofErr w:type="spellEnd"/>
-      <w:r>
-        <w:t>'}, '@4': {'solicitud': 'Consumo total de todos los dispositivos en el año 2024', 'escenario': '</w:t>
-      </w:r>
-      <w:proofErr w:type="spellStart"/>
-      <w:r>
-        <w:t>consumo_basico</w:t>
-      </w:r>
-      <w:proofErr w:type="spellEnd"/>
-      <w:r>
-        <w:t>'}}</w:t>
-      </w:r>
-    </w:p>
-    <w:p>
-      <w:pPr>
-        <w:rPr>
-          <w:b/>
-          <w:bCs/>
-        </w:rPr>
-      </w:pPr>
-      <w:r>
-        <w:rPr>
-          <w:b/>
-          <w:bCs/>
-        </w:rPr>
-        <w:t>Las notas tomadas fueron:</w:t>
-      </w:r>
-    </w:p>
-    <w:p>
-      <w:r>
-        <w:t>La comparación entre consumo de nevera y lavadora se realizará considerando solo estos dos días. El usuario también pidió que se incluyan gráficas para visualizar los consumos totales del año 2024.</w:t>
-      </w:r>
-    </w:p>
-    <w:p>
-      <w:pPr>
-        <w:pStyle w:val="Ttulo3"/>
-      </w:pPr>
-      <w:r>
-        <w:t xml:space="preserve">Resultado </w:t>
-      </w:r>
-      <w:proofErr w:type="spellStart"/>
-      <w:r>
-        <w:t>deepseek</w:t>
-      </w:r>
-      <w:proofErr w:type="spellEnd"/>
-      <w:r>
-        <w:t xml:space="preserve"> r1 8b (Local)</w:t>
-      </w:r>
-    </w:p>
-    <w:p>
-      <w:pPr>
-        <w:rPr>
-          <w:b/>
-          <w:bCs/>
-        </w:rPr>
-      </w:pPr>
-      <w:r>
-        <w:rPr>
-          <w:b/>
-          <w:bCs/>
-        </w:rPr>
-        <w:t>Las peticiones categorizadas fueron:</w:t>
-      </w:r>
-    </w:p>
-    <w:p>
-      <w:r>
-        <w:t>{'@1': {'solicitud': 'Cuánto consumió mi nevera ayer por la noche y cuánto consumió mi lavadora el sábado pasado en la mañana.', 'escenario': '</w:t>
-      </w:r>
-      <w:proofErr w:type="spellStart"/>
-      <w:r>
-        <w:t>consumo_basico</w:t>
-      </w:r>
-      <w:proofErr w:type="spellEnd"/>
-      <w:r>
-        <w:t>'}, '@2': {'solicitud': 'Comparación de los consumos de la nevera y la lavadora entre ayer y el sábado pasado.', 'escenario': '</w:t>
-      </w:r>
-      <w:proofErr w:type="spellStart"/>
-      <w:r>
-        <w:t>comparacion_consumos</w:t>
-      </w:r>
-      <w:proofErr w:type="spellEnd"/>
-      <w:r>
-        <w:t>'}, '@3': {'solicitud': 'Resumen anual del consumo energético de todos los dispositivos en el año 2024 con formato gráfico.', 'escenario': '</w:t>
-      </w:r>
-      <w:proofErr w:type="spellStart"/>
-      <w:r>
-        <w:t>consumo_basico</w:t>
-      </w:r>
-      <w:proofErr w:type="spellEnd"/>
-      <w:r>
-        <w:t>'}}</w:t>
-      </w:r>
-    </w:p>
-    <w:p>
-      <w:pPr>
-        <w:rPr>
-          <w:b/>
-          <w:bCs/>
-        </w:rPr>
-      </w:pPr>
-      <w:r>
-        <w:rPr>
-          <w:b/>
-          <w:bCs/>
-        </w:rPr>
-        <w:t>Las notas tomadas fueron:</w:t>
-      </w:r>
-    </w:p>
-    <w:p>
-      <w:r>
-        <w:t>La experiencia de ver que el celular se descargó mientras revisaba los consumos puede haber influido en la decisión de querer obtener una comparación, pero no constituye una solicitud operativa.</w:t>
-      </w:r>
-    </w:p>
-    <w:p>
-      <w:pPr>
-        <w:pStyle w:val="Ttulo3"/>
-      </w:pPr>
-      <w:r>
-        <w:t>Resultado Gemma 7b (Local)</w:t>
-      </w:r>
-    </w:p>
-    <w:p>
-      <w:pPr>
-        <w:rPr>
-          <w:b/>
-          <w:bCs/>
-        </w:rPr>
-      </w:pPr>
-      <w:r>
-        <w:rPr>
-          <w:b/>
-          <w:bCs/>
-        </w:rPr>
-        <w:t>Las peticiones categorizadas fueron:</w:t>
-      </w:r>
-    </w:p>
-    <w:p>
-      <w:r>
-        <w:t>{'1': {'solicitud': 'Consumir de la nevera ayer por la noche y de la lavadora el sábado pasado por la mañana.', 'escenario': '</w:t>
-      </w:r>
-      <w:proofErr w:type="spellStart"/>
-      <w:r>
-        <w:t>consumo_basico</w:t>
-      </w:r>
-      <w:proofErr w:type="spellEnd"/>
-      <w:r>
-        <w:t>'}, '2': {'solicitud': 'Comparar el consumo de energía entre la nevera y la lavadora en los dos días mencionados.', 'escenario': '</w:t>
-      </w:r>
-      <w:proofErr w:type="spellStart"/>
-      <w:r>
-        <w:t>comparacion_consumos</w:t>
-      </w:r>
-      <w:proofErr w:type="spellEnd"/>
-      <w:r>
-        <w:t>'}, '3': {'solicitud': 'Identificar picos de consumo o tendencias sostenidas en los consumos de los dos días mencionados.', 'escenario': '</w:t>
-      </w:r>
-      <w:proofErr w:type="spellStart"/>
-      <w:r>
-        <w:t>deteccion_anomalias_tendencias</w:t>
-      </w:r>
-      <w:proofErr w:type="spellEnd"/>
-      <w:r>
-        <w:t>'}, '4': {'solicitud': 'Establecer el consumo total de energía de todos los dispositivos en el año 2024.', 'escenario': '</w:t>
-      </w:r>
-      <w:proofErr w:type="spellStart"/>
-      <w:r>
-        <w:t>prediccion_estimacion</w:t>
-      </w:r>
-      <w:proofErr w:type="spellEnd"/>
-      <w:r>
-        <w:t>'}}</w:t>
-      </w:r>
-    </w:p>
-    <w:p>
-      <w:pPr>
-        <w:rPr>
-          <w:b/>
-          <w:bCs/>
-        </w:rPr>
-      </w:pPr>
-      <w:r>
-        <w:rPr>
-          <w:b/>
-          <w:bCs/>
-        </w:rPr>
-        <w:t>Las notas tomadas fueron:</w:t>
-      </w:r>
-    </w:p>
-    <w:p>
-      <w:r>
-        <w:t>El usuario también solicita información sobre el consumo de todos los dispositivos en el año 2024, y desea ver gráficas. Sin embargo, estas solicitudes no se pueden categorizar como una sola solicitud específica o escenario de entrada admitido por el sistema.</w:t>
-      </w:r>
-    </w:p>
-    <w:p>
-      <w:pPr>
-        <w:pStyle w:val="Ttulo3"/>
-      </w:pPr>
-      <w:r>
-        <w:t>Resultado Mistral 7b (Local)</w:t>
-      </w:r>
-    </w:p>
-    <w:p>
-      <w:pPr>
-        <w:rPr>
-          <w:b/>
-          <w:bCs/>
-        </w:rPr>
-      </w:pPr>
-      <w:r>
-        <w:rPr>
-          <w:b/>
-          <w:bCs/>
-        </w:rPr>
-        <w:t>Las peticiones categorizadas fueron:</w:t>
-      </w:r>
-    </w:p>
-    <w:p>
-      <w:r>
-        <w:t>{'@1': {'solicitud': 'Consumo de la nevera el día anterior por la noche', 'escenario': '</w:t>
-      </w:r>
-      <w:proofErr w:type="spellStart"/>
-      <w:r>
-        <w:t>consumo_basico</w:t>
-      </w:r>
-      <w:proofErr w:type="spellEnd"/>
-      <w:r>
-        <w:t>'}, '@2': {'solicitud': 'Consumo de la lavadora el sábado pasado en la mañana', 'escenario': '</w:t>
-      </w:r>
-      <w:proofErr w:type="spellStart"/>
-      <w:r>
-        <w:t>consumo_basico</w:t>
-      </w:r>
-      <w:proofErr w:type="spellEnd"/>
-      <w:r>
-        <w:t>'}, '@3': {'solicitud': 'Comparación del consumo entre nevera y lavadora', 'escenario': '</w:t>
-      </w:r>
-      <w:proofErr w:type="spellStart"/>
-      <w:r>
-        <w:t>comparacion_consumos</w:t>
-      </w:r>
-      <w:proofErr w:type="spellEnd"/>
-      <w:r>
-        <w:t>'}}</w:t>
-      </w:r>
-    </w:p>
-    <w:p>
-      <w:pPr>
-        <w:rPr>
-          <w:b/>
-          <w:bCs/>
-        </w:rPr>
-      </w:pPr>
-      <w:r>
-        <w:rPr>
-          <w:b/>
-          <w:bCs/>
-        </w:rPr>
-        <w:t>Las notas tomadas fueron:</w:t>
-      </w:r>
-    </w:p>
-    <w:p>
-      <w:r>
-        <w:t>El usuario también solicita información sobre el consumo de todos los dispositivos en el año 2024, y desea ver gráficas. Sin embargo, estas solicitudes no se pueden categorizar como una sola solicitud específica o escenario de entrada admitido por el sistema.</w:t>
-      </w:r>
-    </w:p>
-    <w:p>
-      <w:pPr>
-        <w:pStyle w:val="Ttulo3"/>
         <w:rPr>
           <w:lang w:val="en-US"/>
         </w:rPr>
@@ -2559,624 +3156,8 @@
         <w:rPr>
           <w:lang w:val="en-US"/>
         </w:rPr>
-        <w:t xml:space="preserve"> Qwen3 4b (Local)</w:t>
-      </w:r>
-    </w:p>
-    <w:p>
-      <w:pPr>
-        <w:rPr>
-          <w:lang w:val="en-US"/>
-        </w:rPr>
-      </w:pPr>
-      <w:r>
-        <w:rPr>
-          <w:lang w:val="en-US"/>
-        </w:rPr>
-        <w:t xml:space="preserve">2025/12/20 18:08:49 WARNING </w:t>
-      </w:r>
-      <w:proofErr w:type="spellStart"/>
-      <w:proofErr w:type="gramStart"/>
-      <w:r>
-        <w:rPr>
-          <w:lang w:val="en-US"/>
-        </w:rPr>
-        <w:t>dspy.adapters</w:t>
-      </w:r>
-      <w:proofErr w:type="gramEnd"/>
-      <w:r>
-        <w:rPr>
-          <w:lang w:val="en-US"/>
-        </w:rPr>
-        <w:t>.json_adapter</w:t>
-      </w:r>
-      <w:proofErr w:type="spellEnd"/>
-      <w:r>
-        <w:rPr>
-          <w:lang w:val="en-US"/>
-        </w:rPr>
-        <w:t>: Failed to use structured output format, falling back to JSON mode.</w:t>
-      </w:r>
-    </w:p>
-    <w:p>
-      <w:r>
-        <w:t xml:space="preserve">El modelo genera razonamiento en texto libre y fragmentos de JSON inválido, sin cumplir el esquema exigido por el sistema. La respuesta no es </w:t>
-      </w:r>
-      <w:proofErr w:type="spellStart"/>
-      <w:r>
-        <w:t>parseable</w:t>
-      </w:r>
-      <w:proofErr w:type="spellEnd"/>
-      <w:r>
-        <w:t xml:space="preserve"> ni usable por el pipeline</w:t>
-      </w:r>
-      <w:r>
-        <w:t>. También parece confundirse con el razonamiento interno del modelo.</w:t>
-      </w:r>
-    </w:p>
-    <w:p>
-      <w:pPr>
-        <w:pStyle w:val="Ttulo3"/>
-      </w:pPr>
-      <w:r>
-        <w:t xml:space="preserve">Resultado </w:t>
-      </w:r>
-      <w:r>
-        <w:t xml:space="preserve">Llama 3.3 70b </w:t>
-      </w:r>
-      <w:r>
-        <w:t>(</w:t>
-      </w:r>
-      <w:proofErr w:type="spellStart"/>
-      <w:r>
-        <w:t>OpenRouter</w:t>
-      </w:r>
-      <w:proofErr w:type="spellEnd"/>
-      <w:r>
-        <w:t>)</w:t>
-      </w:r>
-    </w:p>
-    <w:p>
-      <w:pPr>
-        <w:rPr>
-          <w:b/>
-          <w:bCs/>
-        </w:rPr>
-      </w:pPr>
-      <w:r>
-        <w:rPr>
-          <w:b/>
-          <w:bCs/>
-        </w:rPr>
-        <w:t>Las peticiones categorizadas fueron:</w:t>
-      </w:r>
-    </w:p>
-    <w:p>
-      <w:r>
-        <w:t>{'@1': {'solicitud': 'consumo de la nevera ayer por la noche', 'escenario': '</w:t>
-      </w:r>
-      <w:proofErr w:type="spellStart"/>
-      <w:r>
-        <w:t>consumo_basico</w:t>
-      </w:r>
-      <w:proofErr w:type="spellEnd"/>
-      <w:r>
-        <w:t>'}, '@2': {'solicitud': 'consumo de la lavadora el sábado pasado en la mañana', 'escenario': '</w:t>
-      </w:r>
-      <w:proofErr w:type="spellStart"/>
-      <w:r>
-        <w:t>consumo_basico</w:t>
-      </w:r>
-      <w:proofErr w:type="spellEnd"/>
-      <w:r>
-        <w:t>'}, '@3': {'solicitud': 'comparación de consumos entre la nevera y la lavadora', 'escenario': '</w:t>
-      </w:r>
-      <w:proofErr w:type="spellStart"/>
-      <w:r>
-        <w:t>comparacion_consumos</w:t>
-      </w:r>
-      <w:proofErr w:type="spellEnd"/>
-      <w:r>
-        <w:t>'}, '@4': {'solicitud': 'consumo total de todos los dispositivos en el año 2024', 'escenario': '</w:t>
-      </w:r>
-      <w:proofErr w:type="spellStart"/>
-      <w:r>
-        <w:t>consumo_basico</w:t>
-      </w:r>
-      <w:proofErr w:type="spellEnd"/>
-      <w:r>
-        <w:t>'}}</w:t>
-      </w:r>
-    </w:p>
-    <w:p>
-      <w:pPr>
-        <w:rPr>
-          <w:b/>
-          <w:bCs/>
-        </w:rPr>
-      </w:pPr>
-      <w:r>
-        <w:rPr>
-          <w:b/>
-          <w:bCs/>
-        </w:rPr>
-        <w:t>Las notas tomadas fueron:</w:t>
-      </w:r>
-    </w:p>
-    <w:p>
-      <w:r>
-        <w:t>El usuario menciona que se le descargó el celular y no se paró a buscar el cargador, y también menciona que su papá pidió ver gráficas de todo lo que se pueda. Estos comentarios no están relacionados con las solicitudes de consumo energético y se consideran información adicional o contexto narrativo.</w:t>
-      </w:r>
-    </w:p>
-    <w:p>
-      <w:pPr>
-        <w:pStyle w:val="Ttulo3"/>
-      </w:pPr>
-      <w:r>
-        <w:t xml:space="preserve">Resultado </w:t>
-      </w:r>
-      <w:r>
-        <w:t xml:space="preserve">Gemini 2.0 Flash </w:t>
-      </w:r>
-      <w:r>
-        <w:t>experimental (</w:t>
-      </w:r>
-      <w:proofErr w:type="spellStart"/>
-      <w:r>
-        <w:t>OpenRouter</w:t>
-      </w:r>
-      <w:proofErr w:type="spellEnd"/>
-      <w:r>
-        <w:t>)</w:t>
-      </w:r>
-    </w:p>
-    <w:p>
-      <w:pPr>
-        <w:rPr>
-          <w:b/>
-          <w:bCs/>
-        </w:rPr>
-      </w:pPr>
-      <w:r>
-        <w:rPr>
-          <w:b/>
-          <w:bCs/>
-        </w:rPr>
-        <w:t>Las peticiones categorizadas fueron:</w:t>
-      </w:r>
-    </w:p>
-    <w:p>
-      <w:r>
-        <w:t>{'@1': {'solicitud': 'Determinar el consumo energético de la nevera durante la noche de ayer.', 'escenario': '</w:t>
-      </w:r>
-      <w:proofErr w:type="spellStart"/>
-      <w:r>
-        <w:t>consumo_basico</w:t>
-      </w:r>
-      <w:proofErr w:type="spellEnd"/>
-      <w:r>
-        <w:t>'}, '@2': {'solicitud': 'Determinar el consumo energético de la lavadora durante la mañana del sábado pasado.', 'escenario': '</w:t>
-      </w:r>
-      <w:proofErr w:type="spellStart"/>
-      <w:r>
-        <w:t>consumo_basico</w:t>
-      </w:r>
-      <w:proofErr w:type="spellEnd"/>
-      <w:r>
-        <w:t>'}, '@3': {'solicitud': 'Comparar el consumo energético de la nevera (noche de ayer) con el de la lavadora (mañana del sábado pasado) para determinar cuál consumió más energía.', 'escenario': '</w:t>
-      </w:r>
-      <w:proofErr w:type="spellStart"/>
-      <w:r>
-        <w:t>comparacion_consumos</w:t>
-      </w:r>
-      <w:proofErr w:type="spellEnd"/>
-      <w:r>
-        <w:t>'}, '@4': {'solicitud': 'Mostrar el consumo de todos los dispositivos en el año 2024.', 'escenario': '</w:t>
-      </w:r>
-      <w:proofErr w:type="spellStart"/>
-      <w:r>
-        <w:t>consumo_basico</w:t>
-      </w:r>
-      <w:proofErr w:type="spellEnd"/>
-      <w:r>
-        <w:t>'}, '@5': {'solicitud': 'Generar representaciones gráficas del consumo energético de los dispositivos en el año 2024.', 'escenario': '</w:t>
-      </w:r>
-      <w:proofErr w:type="spellStart"/>
-      <w:r>
-        <w:t>consumo_basico</w:t>
-      </w:r>
-      <w:proofErr w:type="spellEnd"/>
-      <w:r>
-        <w:t>'}}</w:t>
-      </w:r>
-    </w:p>
-    <w:p>
-      <w:pPr>
-        <w:rPr>
-          <w:b/>
-          <w:bCs/>
-        </w:rPr>
-      </w:pPr>
-      <w:r>
-        <w:rPr>
-          <w:b/>
-          <w:bCs/>
-        </w:rPr>
-        <w:t>Las notas tomadas fueron:</w:t>
-      </w:r>
-    </w:p>
-    <w:p>
-      <w:r>
-        <w:t>"El comentario sobre la descarga del celular y la pereza de buscar el cargador es irrelevante para las solicitudes de consumo energético."</w:t>
-      </w:r>
-    </w:p>
-    <w:p>
-      <w:pPr>
-        <w:pStyle w:val="Ttulo3"/>
-      </w:pPr>
-      <w:r>
-        <w:t xml:space="preserve">Resultado </w:t>
-      </w:r>
-      <w:r>
-        <w:t>Mistral Devstral2</w:t>
-      </w:r>
-      <w:r>
         <w:t xml:space="preserve"> </w:t>
       </w:r>
-      <w:r>
-        <w:t>123b</w:t>
-      </w:r>
-      <w:r>
-        <w:t xml:space="preserve"> </w:t>
-      </w:r>
-      <w:r>
-        <w:t>(</w:t>
-      </w:r>
-      <w:proofErr w:type="spellStart"/>
-      <w:r>
-        <w:t>OpenRouter</w:t>
-      </w:r>
-      <w:proofErr w:type="spellEnd"/>
-      <w:r>
-        <w:t>)</w:t>
-      </w:r>
-    </w:p>
-    <w:p>
-      <w:pPr>
-        <w:rPr>
-          <w:b/>
-          <w:bCs/>
-        </w:rPr>
-      </w:pPr>
-      <w:r>
-        <w:rPr>
-          <w:b/>
-          <w:bCs/>
-        </w:rPr>
-        <w:t>Las peticiones categorizadas fueron:</w:t>
-      </w:r>
-    </w:p>
-    <w:p>
-      <w:r>
-        <w:t>{'@1': {'solicitud': 'Necesito saber cuánto consumió mi nevera ayer por la noche', 'escenario': '</w:t>
-      </w:r>
-      <w:proofErr w:type="spellStart"/>
-      <w:r>
-        <w:t>consumo_basico</w:t>
-      </w:r>
-      <w:proofErr w:type="spellEnd"/>
-      <w:r>
-        <w:t>'}, '@2': {'solicitud': 'cuánto consumió mi lavadora el sábado pasado en la mañana', 'escenario': '</w:t>
-      </w:r>
-      <w:proofErr w:type="spellStart"/>
-      <w:r>
-        <w:t>consumo_basico</w:t>
-      </w:r>
-      <w:proofErr w:type="spellEnd"/>
-      <w:r>
-        <w:t>'}, '@3': {'solicitud': 'quiero que me digas si entre esos dos días cuál gastó más energía', 'escenario': '</w:t>
-      </w:r>
-      <w:proofErr w:type="spellStart"/>
-      <w:r>
-        <w:t>comparacion_consumos</w:t>
-      </w:r>
-      <w:proofErr w:type="spellEnd"/>
-      <w:r>
-        <w:t>'}, '@4': {'solicitud': 'cuánto fue el consumo de todos los dispositivos en el año 2024', 'escenario': '</w:t>
-      </w:r>
-      <w:proofErr w:type="spellStart"/>
-      <w:r>
-        <w:t>consumo_basico</w:t>
-      </w:r>
-      <w:proofErr w:type="spellEnd"/>
-      <w:r>
-        <w:t>'}, '@5': {'solicitud': 'quiero ver gráficas de todo lo que se pueda', 'escenario': '</w:t>
-      </w:r>
-      <w:proofErr w:type="spellStart"/>
-      <w:r>
-        <w:t>consumo_basico</w:t>
-      </w:r>
-      <w:proofErr w:type="spellEnd"/>
-      <w:r>
-        <w:t>'}}</w:t>
-      </w:r>
-    </w:p>
-    <w:p>
-      <w:pPr>
-        <w:rPr>
-          <w:b/>
-          <w:bCs/>
-        </w:rPr>
-      </w:pPr>
-      <w:r>
-        <w:rPr>
-          <w:b/>
-          <w:bCs/>
-        </w:rPr>
-        <w:t>Las notas tomadas fueron:</w:t>
-      </w:r>
-    </w:p>
-    <w:p>
-      <w:r>
-        <w:t>"Además, mientras miraba esos consumos se me descargó el celular y me dio mucha pereza pararme a buscar el cargador, pero igual quiero la comparación. Papá también pidió que le dijeras..."</w:t>
-      </w:r>
-    </w:p>
-    <w:p>
-      <w:pPr>
-        <w:pStyle w:val="Ttulo3"/>
-      </w:pPr>
-      <w:r>
-        <w:t xml:space="preserve">Resultado </w:t>
-      </w:r>
-      <w:r>
-        <w:t>Xiaomi MimoV2 Flash 15b 309b</w:t>
-      </w:r>
-      <w:r>
-        <w:t xml:space="preserve"> </w:t>
-      </w:r>
-      <w:r>
-        <w:t>(</w:t>
-      </w:r>
-      <w:proofErr w:type="spellStart"/>
-      <w:r>
-        <w:t>OpenRouter</w:t>
-      </w:r>
-      <w:proofErr w:type="spellEnd"/>
-      <w:r>
-        <w:t>)</w:t>
-      </w:r>
-    </w:p>
-    <w:p>
-      <w:pPr>
-        <w:rPr>
-          <w:b/>
-          <w:bCs/>
-        </w:rPr>
-      </w:pPr>
-      <w:r>
-        <w:rPr>
-          <w:b/>
-          <w:bCs/>
-        </w:rPr>
-        <w:t>Las peticiones categorizadas fueron:</w:t>
-      </w:r>
-    </w:p>
-    <w:p>
-      <w:pPr>
-        <w:rPr>
-          <w:u w:val="single"/>
-        </w:rPr>
-      </w:pPr>
-      <w:r>
-        <w:t>{'@1': {'solicitud': 'Obtener el consumo energético de la nevera durante la noche del día anterior al momento de la consulta.', 'escenario': '</w:t>
-      </w:r>
-      <w:proofErr w:type="spellStart"/>
-      <w:r>
-        <w:t>consumo_basico</w:t>
-      </w:r>
-      <w:proofErr w:type="spellEnd"/>
-      <w:r>
-        <w:t>'}, '@2': {'solicitud': 'Obtener el consumo energético de la lavadora durante la mañana del sábado anterior al momento de la consulta.', 'escenario': '</w:t>
-      </w:r>
-      <w:proofErr w:type="spellStart"/>
-      <w:r>
-        <w:t>consumo_basico</w:t>
-      </w:r>
-      <w:proofErr w:type="spellEnd"/>
-      <w:r>
-        <w:t>'}, '@3': {'solicitud': 'Comparar el consumo energético de la nevera (noche anterior) y la lavadora (sábado por la mañana) para determinar cuál gastó más energía.', 'escenario': '</w:t>
-      </w:r>
-      <w:proofErr w:type="spellStart"/>
-      <w:r>
-        <w:t>comparacion_consumos</w:t>
-      </w:r>
-      <w:proofErr w:type="spellEnd"/>
-      <w:r>
-        <w:t>'}, '@4': {'solicitud': 'Obtener el consumo energético total de todos los dispositivos del hogar para el año 2024.', 'escenario': '</w:t>
-      </w:r>
-      <w:proofErr w:type="spellStart"/>
-      <w:r>
-        <w:t>consumo_basico</w:t>
-      </w:r>
-      <w:proofErr w:type="spellEnd"/>
-      <w:r>
-        <w:t>'}, '@5': {'solicitud': 'Generar visualizaciones y gráficas de los datos de consumo energético disponibles para el año 2024.', 'escenario': '</w:t>
-      </w:r>
-      <w:proofErr w:type="spellStart"/>
-      <w:r>
-        <w:t>consumo_basico</w:t>
-      </w:r>
-      <w:proofErr w:type="spellEnd"/>
-      <w:r>
-        <w:t>'}}</w:t>
-      </w:r>
-    </w:p>
-    <w:p>
-      <w:pPr>
-        <w:rPr>
-          <w:b/>
-          <w:bCs/>
-        </w:rPr>
-      </w:pPr>
-      <w:r>
-        <w:rPr>
-          <w:b/>
-          <w:bCs/>
-        </w:rPr>
-        <w:t>Las notas tomadas fueron:</w:t>
-      </w:r>
-    </w:p>
-    <w:p>
-      <w:r>
-        <w:t>Mientras miraba los consumos se le descargó el celular y le dio mucha pereza pararse a buscar el cargador. Papá también pidió la información de consumo para el año 2024.</w:t>
-      </w:r>
-    </w:p>
-    <w:p>
-      <w:pPr>
-        <w:pStyle w:val="Ttulo3"/>
-      </w:pPr>
-      <w:r>
-        <w:t xml:space="preserve">Resultado </w:t>
-      </w:r>
-      <w:proofErr w:type="spellStart"/>
-      <w:r>
-        <w:t>Qwen</w:t>
-      </w:r>
-      <w:proofErr w:type="spellEnd"/>
-      <w:r>
-        <w:t xml:space="preserve"> 3 </w:t>
-      </w:r>
-      <w:proofErr w:type="spellStart"/>
-      <w:r>
-        <w:t>Coder</w:t>
-      </w:r>
-      <w:proofErr w:type="spellEnd"/>
-      <w:r>
-        <w:t xml:space="preserve"> 35b 480b</w:t>
-      </w:r>
-      <w:r>
-        <w:t xml:space="preserve"> </w:t>
-      </w:r>
-      <w:r>
-        <w:t>(</w:t>
-      </w:r>
-      <w:proofErr w:type="spellStart"/>
-      <w:r>
-        <w:t>OpenRouter</w:t>
-      </w:r>
-      <w:proofErr w:type="spellEnd"/>
-      <w:r>
-        <w:t>)</w:t>
-      </w:r>
-    </w:p>
-    <w:p>
-      <w:pPr>
-        <w:rPr>
-          <w:b/>
-          <w:bCs/>
-        </w:rPr>
-      </w:pPr>
-      <w:r>
-        <w:rPr>
-          <w:b/>
-          <w:bCs/>
-        </w:rPr>
-        <w:t>Las peticiones categorizadas fueron:</w:t>
-      </w:r>
-    </w:p>
-    <w:p>
-      <w:r>
-        <w:t>{'@1': {'solicitud': 'Obtener el consumo energético de la nevera durante la noche del día anterior.', 'escenario': '</w:t>
-      </w:r>
-      <w:proofErr w:type="spellStart"/>
-      <w:r>
-        <w:t>consumo_basico</w:t>
-      </w:r>
-      <w:proofErr w:type="spellEnd"/>
-      <w:r>
-        <w:t>'}, '@2': {'solicitud': 'Obtener el consumo energético de la lavadora durante la mañana del sábado pasado.', 'escenario': '</w:t>
-      </w:r>
-      <w:proofErr w:type="spellStart"/>
-      <w:r>
-        <w:t>consumo_basico</w:t>
-      </w:r>
-      <w:proofErr w:type="spellEnd"/>
-      <w:r>
-        <w:t>'}, '@3': {'solicitud': 'Comparar el consumo energético entre la nevera (ayer por la noche) y la lavadora (sábado pasado en la mañana) para determinar cuál gastó más energía.', 'escenario': '</w:t>
-      </w:r>
-      <w:proofErr w:type="spellStart"/>
-      <w:r>
-        <w:t>comparacion_consumos</w:t>
-      </w:r>
-      <w:proofErr w:type="spellEnd"/>
-      <w:r>
-        <w:t>'}, '@4': {'solicitud': 'Obtener el consumo energético total de todos los dispositivos del hogar durante el año 2024.', 'escenario': '</w:t>
-      </w:r>
-      <w:proofErr w:type="spellStart"/>
-      <w:r>
-        <w:t>consumo_basico</w:t>
-      </w:r>
-      <w:proofErr w:type="spellEnd"/>
-      <w:r>
-        <w:t>'}, '@5': {'solicitud': 'Generar gráficas del consumo energético de los dispositivos del hogar para el año 2024.', 'escenario': '</w:t>
-      </w:r>
-      <w:proofErr w:type="spellStart"/>
-      <w:r>
-        <w:t>entrada_inadmisible</w:t>
-      </w:r>
-      <w:proofErr w:type="spellEnd"/>
-      <w:r>
-        <w:t>'}}</w:t>
-      </w:r>
-    </w:p>
-    <w:p>
-      <w:pPr>
-        <w:rPr>
-          <w:b/>
-          <w:bCs/>
-        </w:rPr>
-      </w:pPr>
-      <w:r>
-        <w:rPr>
-          <w:b/>
-          <w:bCs/>
-        </w:rPr>
-        <w:t>Las notas tomadas fueron:</w:t>
-      </w:r>
-    </w:p>
-    <w:p>
-      <w:r>
-        <w:t xml:space="preserve">El usuario menciona que su celular se descargó y le dio pereza buscar el cargador, lo cual no constituye una solicitud operativa. Además, comenta que su papá también hizo una solicitud, lo cual aporta contexto </w:t>
-      </w:r>
-      <w:proofErr w:type="gramStart"/>
-      <w:r>
-        <w:t>narrativo</w:t>
-      </w:r>
-      <w:proofErr w:type="gramEnd"/>
-      <w:r>
-        <w:t xml:space="preserve"> pero no modifica la estructura de las solicitudes identificadas.</w:t>
-      </w:r>
-    </w:p>
-    <w:p>
-      <w:pPr>
-        <w:pStyle w:val="Ttulo3"/>
-        <w:rPr>
-          <w:lang w:val="en-US"/>
-        </w:rPr>
-      </w:pPr>
-      <w:proofErr w:type="spellStart"/>
-      <w:r>
-        <w:rPr>
-          <w:lang w:val="en-US"/>
-        </w:rPr>
-        <w:t>Resultado</w:t>
-      </w:r>
-      <w:proofErr w:type="spellEnd"/>
-      <w:r>
-        <w:rPr>
-          <w:lang w:val="en-US"/>
-        </w:rPr>
-        <w:t xml:space="preserve"> </w:t>
-      </w:r>
       <w:proofErr w:type="spellStart"/>
       <w:r>
         <w:rPr>
@@ -3189,19 +3170,7 @@
         <w:rPr>
           <w:lang w:val="en-US"/>
         </w:rPr>
-        <w:t xml:space="preserve"> R1 T2 Chimera 671b</w:t>
-      </w:r>
-      <w:r>
-        <w:rPr>
-          <w:lang w:val="en-US"/>
-        </w:rPr>
-        <w:t xml:space="preserve"> </w:t>
-      </w:r>
-      <w:r>
-        <w:rPr>
-          <w:lang w:val="en-US"/>
-        </w:rPr>
-        <w:t>(</w:t>
+        <w:t xml:space="preserve"> R1 T2 Chimera 671b (</w:t>
       </w:r>
       <w:proofErr w:type="spellStart"/>
       <w:r>
@@ -3582,27 +3551,7 @@
         <w:t xml:space="preserve">1) </w:t>
       </w:r>
       <w:r>
-        <w:t xml:space="preserve">Se ajustó la definición del escenario de consumo básico para enfatizar que su intención es la </w:t>
-      </w:r>
-      <w:r>
-        <w:rPr>
-          <w:b/>
-          <w:bCs/>
-        </w:rPr>
-        <w:t>consulta o recuperación de valores cuantitativos ya registrados</w:t>
-      </w:r>
-      <w:r>
-        <w:t xml:space="preserve">, delimitando claramente que este escenario no abarca decisiones sobre </w:t>
-      </w:r>
-      <w:r>
-        <w:rPr>
-          <w:b/>
-          <w:bCs/>
-        </w:rPr>
-        <w:t>formatos de presentación, visualización o representación gráfica</w:t>
-      </w:r>
-      <w:r>
-        <w:t xml:space="preserve"> de los resultados. Este refuerzo busca reducir interpretaciones ambiguas por parte del modelo y evitar la clasificación incorrecta de solicitudes de visualización como consultas de consumo básico.</w:t>
+        <w:t>Se ajustó la definición del escenario de consumo básico para enfatizar que su intención es la consulta o recuperación de valores cuantitativos ya registrados, delimitando de forma más precisa su alcance semántico y reduciendo interpretaciones ambiguas por parte del modelo en torno a solicitudes que no implican obtención directa de datos energéticos.</w:t>
       </w:r>
     </w:p>
     <w:p>
@@ -3617,38 +3566,690 @@
         <w:t xml:space="preserve"> </w:t>
       </w:r>
       <w:r>
-        <w:rPr>
-          <w:b/>
-          <w:bCs/>
-        </w:rPr>
-        <w:t xml:space="preserve">Se documentó un </w:t>
-      </w:r>
-      <w:r>
-        <w:rPr>
-          <w:b/>
-          <w:bCs/>
-        </w:rPr>
-        <w:t xml:space="preserve">sexto </w:t>
-      </w:r>
-      <w:r>
-        <w:rPr>
-          <w:b/>
-          <w:bCs/>
-        </w:rPr>
-        <w:t xml:space="preserve">escenario adicional </w:t>
-      </w:r>
-      <w:r>
-        <w:t xml:space="preserve">orientado a solicitudes relacionadas con la </w:t>
-      </w:r>
-      <w:r>
-        <w:rPr>
-          <w:b/>
-          <w:bCs/>
-        </w:rPr>
-        <w:t>visualización, presentación o representación gráfica</w:t>
-      </w:r>
-      <w:r>
-        <w:t xml:space="preserve"> de la información energética. Aunque en la implementación actual estas solicitudes deben clasificarse como </w:t>
+        <w:t>Se incorporó en la estructura de las solicitudes categorizadas un atributo adicional de formato, destinado a capturar la preferencia del usuario sobre la forma de presentación esperada de la respuesta (texto, gráfico, mixto o no especificado). Esta decisión permite desacoplar la intención analítica de la preferencia de presentación, evitando la proliferación de escenarios artificiales y facilitando la extensibilidad futura del sistema hacia capacidades de visualización.</w:t>
+      </w:r>
+    </w:p>
+    <w:p>
+      <w:pPr>
+        <w:pStyle w:val="Ttulo3"/>
+      </w:pPr>
+      <w:proofErr w:type="spellStart"/>
+      <w:r>
+        <w:t>Signature</w:t>
+      </w:r>
+      <w:proofErr w:type="spellEnd"/>
+    </w:p>
+    <w:p/>
+    <w:p>
+      <w:proofErr w:type="spellStart"/>
+      <w:r>
+        <w:t>class</w:t>
+      </w:r>
+      <w:proofErr w:type="spellEnd"/>
+      <w:r>
+        <w:t xml:space="preserve"> Interpretador(</w:t>
+      </w:r>
+      <w:proofErr w:type="spellStart"/>
+      <w:proofErr w:type="gramStart"/>
+      <w:r>
+        <w:t>dspy.Signature</w:t>
+      </w:r>
+      <w:proofErr w:type="spellEnd"/>
+      <w:proofErr w:type="gramEnd"/>
+      <w:r>
+        <w:t>):</w:t>
+      </w:r>
+    </w:p>
+    <w:p>
+      <w:r>
+        <w:t xml:space="preserve">    "El interpretador se encarga de identificar y categorizar las solicitudes e indicaciones adicionales realizadas por el usuario, para facilitar una posterior </w:t>
+      </w:r>
+      <w:proofErr w:type="spellStart"/>
+      <w:r>
+        <w:t>interpretacion</w:t>
+      </w:r>
+      <w:proofErr w:type="spellEnd"/>
+      <w:r>
+        <w:t>."</w:t>
+      </w:r>
+    </w:p>
+    <w:p/>
+    <w:p>
+      <w:pPr>
+        <w:rPr>
+          <w:lang w:val="en-US"/>
+        </w:rPr>
+      </w:pPr>
+      <w:r>
+        <w:t xml:space="preserve">    </w:t>
+      </w:r>
+      <w:proofErr w:type="spellStart"/>
+      <w:r>
+        <w:rPr>
+          <w:lang w:val="en-US"/>
+        </w:rPr>
+        <w:t>prompt_usuario</w:t>
+      </w:r>
+      <w:proofErr w:type="spellEnd"/>
+      <w:r>
+        <w:rPr>
+          <w:lang w:val="en-US"/>
+        </w:rPr>
+        <w:t xml:space="preserve">: str = </w:t>
+      </w:r>
+      <w:proofErr w:type="spellStart"/>
+      <w:proofErr w:type="gramStart"/>
+      <w:r>
+        <w:rPr>
+          <w:lang w:val="en-US"/>
+        </w:rPr>
+        <w:t>dspy.InputField</w:t>
+      </w:r>
+      <w:proofErr w:type="spellEnd"/>
+      <w:proofErr w:type="gramEnd"/>
+      <w:r>
+        <w:rPr>
+          <w:lang w:val="en-US"/>
+        </w:rPr>
+        <w:t>(</w:t>
+      </w:r>
+    </w:p>
+    <w:p>
+      <w:r>
+        <w:rPr>
+          <w:lang w:val="en-US"/>
+        </w:rPr>
+        <w:t xml:space="preserve">        </w:t>
+      </w:r>
+      <w:proofErr w:type="spellStart"/>
+      <w:r>
+        <w:t>desc</w:t>
+      </w:r>
+      <w:proofErr w:type="spellEnd"/>
+      <w:r>
+        <w:t>="</w:t>
+      </w:r>
+      <w:proofErr w:type="spellStart"/>
+      <w:r>
+        <w:t>prompt</w:t>
+      </w:r>
+      <w:proofErr w:type="spellEnd"/>
+      <w:r>
+        <w:t xml:space="preserve"> del usuario en lenguaje natural."</w:t>
+      </w:r>
+    </w:p>
+    <w:p>
+      <w:r>
+        <w:t>    )</w:t>
+      </w:r>
+    </w:p>
+    <w:p/>
+    <w:p>
+      <w:r>
+        <w:t xml:space="preserve">    </w:t>
+      </w:r>
+      <w:proofErr w:type="spellStart"/>
+      <w:r>
+        <w:t>escenarios_entrada</w:t>
+      </w:r>
+      <w:proofErr w:type="spellEnd"/>
+      <w:r>
+        <w:t xml:space="preserve">: dict = </w:t>
+      </w:r>
+      <w:proofErr w:type="spellStart"/>
+      <w:proofErr w:type="gramStart"/>
+      <w:r>
+        <w:t>dspy.InputField</w:t>
+      </w:r>
+      <w:proofErr w:type="spellEnd"/>
+      <w:proofErr w:type="gramEnd"/>
+      <w:r>
+        <w:t>(</w:t>
+      </w:r>
+    </w:p>
+    <w:p>
+      <w:r>
+        <w:t xml:space="preserve">        </w:t>
+      </w:r>
+      <w:proofErr w:type="spellStart"/>
+      <w:r>
+        <w:t>desc</w:t>
+      </w:r>
+      <w:proofErr w:type="spellEnd"/>
+      <w:proofErr w:type="gramStart"/>
+      <w:r>
+        <w:t>=(</w:t>
+      </w:r>
+      <w:proofErr w:type="gramEnd"/>
+    </w:p>
+    <w:p>
+      <w:r>
+        <w:t>            "Escenarios estructurados admitidos por el sistema."</w:t>
+      </w:r>
+    </w:p>
+    <w:p>
+      <w:r>
+        <w:t>        )</w:t>
+      </w:r>
+    </w:p>
+    <w:p>
+      <w:r>
+        <w:t xml:space="preserve">    )   </w:t>
+      </w:r>
+    </w:p>
+    <w:p/>
+    <w:p>
+      <w:r>
+        <w:t xml:space="preserve">    </w:t>
+      </w:r>
+      <w:proofErr w:type="spellStart"/>
+      <w:r>
+        <w:t>solicitudes_categorizadas</w:t>
+      </w:r>
+      <w:proofErr w:type="spellEnd"/>
+      <w:r>
+        <w:t xml:space="preserve">: </w:t>
+      </w:r>
+      <w:proofErr w:type="spellStart"/>
+      <w:r>
+        <w:t>dict</w:t>
+      </w:r>
+      <w:proofErr w:type="spellEnd"/>
+      <w:r>
+        <w:t xml:space="preserve"> = </w:t>
+      </w:r>
+      <w:proofErr w:type="spellStart"/>
+      <w:proofErr w:type="gramStart"/>
+      <w:r>
+        <w:t>dspy.OutputField</w:t>
+      </w:r>
+      <w:proofErr w:type="spellEnd"/>
+      <w:proofErr w:type="gramEnd"/>
+      <w:r>
+        <w:t>(</w:t>
+      </w:r>
+    </w:p>
+    <w:p>
+      <w:r>
+        <w:t xml:space="preserve">    </w:t>
+      </w:r>
+      <w:proofErr w:type="spellStart"/>
+      <w:r>
+        <w:t>desc</w:t>
+      </w:r>
+      <w:proofErr w:type="spellEnd"/>
+      <w:proofErr w:type="gramStart"/>
+      <w:r>
+        <w:t>=(</w:t>
+      </w:r>
+      <w:proofErr w:type="gramEnd"/>
+    </w:p>
+    <w:p>
+      <w:r>
+        <w:t>        "Solicitudes segmentadas y categorizadas por el sistema. "</w:t>
+      </w:r>
+    </w:p>
+    <w:p>
+      <w:r>
+        <w:t>        "El resultado debe ser un único diccionario JSON, donde cada clave "</w:t>
+      </w:r>
+    </w:p>
+    <w:p>
+      <w:r>
+        <w:t>        "tiene el formato '@N' (N es un entero positivo consecutivo comenzando en 1), "</w:t>
+      </w:r>
+    </w:p>
+    <w:p>
+      <w:r>
+        <w:t>        "y cada valor es un diccionario con las siguientes claves:\n"</w:t>
+      </w:r>
+    </w:p>
+    <w:p>
+      <w:r>
+        <w:t>        "'solicitud' (</w:t>
+      </w:r>
+      <w:proofErr w:type="spellStart"/>
+      <w:r>
+        <w:t>string</w:t>
+      </w:r>
+      <w:proofErr w:type="spellEnd"/>
+      <w:r>
+        <w:t>): solicitud específica y detallada, completamente autocontenida.\n"</w:t>
+      </w:r>
+    </w:p>
+    <w:p>
+      <w:r>
+        <w:t>        "'escenario' (</w:t>
+      </w:r>
+      <w:proofErr w:type="spellStart"/>
+      <w:r>
+        <w:t>string</w:t>
+      </w:r>
+      <w:proofErr w:type="spellEnd"/>
+      <w:r>
+        <w:t>): escenario de entrada admitido por el sistema.\n"</w:t>
+      </w:r>
+    </w:p>
+    <w:p>
+      <w:r>
+        <w:t>        "'formato' (</w:t>
+      </w:r>
+      <w:proofErr w:type="spellStart"/>
+      <w:r>
+        <w:t>string</w:t>
+      </w:r>
+      <w:proofErr w:type="spellEnd"/>
+      <w:r>
+        <w:t>): preferencia de presentación de la respuesta (valores: 'texto', 'grafico', 'mixto', '</w:t>
+      </w:r>
+      <w:proofErr w:type="spellStart"/>
+      <w:r>
+        <w:t>no_especificado</w:t>
+      </w:r>
+      <w:proofErr w:type="spellEnd"/>
+      <w:r>
+        <w:t>')."</w:t>
+      </w:r>
+    </w:p>
+    <w:p>
+      <w:pPr>
+        <w:rPr>
+          <w:lang w:val="en-US"/>
+        </w:rPr>
+      </w:pPr>
+      <w:r>
+        <w:t xml:space="preserve">        </w:t>
+      </w:r>
+      <w:r>
+        <w:rPr>
+          <w:lang w:val="en-US"/>
+        </w:rPr>
+        <w:t>)</w:t>
+      </w:r>
+    </w:p>
+    <w:p>
+      <w:pPr>
+        <w:rPr>
+          <w:lang w:val="en-US"/>
+        </w:rPr>
+      </w:pPr>
+      <w:r>
+        <w:rPr>
+          <w:lang w:val="en-US"/>
+        </w:rPr>
+        <w:t>    )</w:t>
+      </w:r>
+    </w:p>
+    <w:p>
+      <w:pPr>
+        <w:rPr>
+          <w:lang w:val="en-US"/>
+        </w:rPr>
+      </w:pPr>
+    </w:p>
+    <w:p>
+      <w:pPr>
+        <w:rPr>
+          <w:lang w:val="en-US"/>
+        </w:rPr>
+      </w:pPr>
+      <w:r>
+        <w:rPr>
+          <w:lang w:val="en-US"/>
+        </w:rPr>
+        <w:t xml:space="preserve">    </w:t>
+      </w:r>
+      <w:proofErr w:type="spellStart"/>
+      <w:r>
+        <w:rPr>
+          <w:lang w:val="en-US"/>
+        </w:rPr>
+        <w:t>notas</w:t>
+      </w:r>
+      <w:proofErr w:type="spellEnd"/>
+      <w:r>
+        <w:rPr>
+          <w:lang w:val="en-US"/>
+        </w:rPr>
+        <w:t xml:space="preserve">: str = </w:t>
+      </w:r>
+      <w:proofErr w:type="spellStart"/>
+      <w:proofErr w:type="gramStart"/>
+      <w:r>
+        <w:rPr>
+          <w:lang w:val="en-US"/>
+        </w:rPr>
+        <w:t>dspy.OutputField</w:t>
+      </w:r>
+      <w:proofErr w:type="spellEnd"/>
+      <w:proofErr w:type="gramEnd"/>
+      <w:r>
+        <w:rPr>
+          <w:lang w:val="en-US"/>
+        </w:rPr>
+        <w:t>(</w:t>
+      </w:r>
+    </w:p>
+    <w:p>
+      <w:pPr>
+        <w:rPr>
+          <w:lang w:val="en-US"/>
+        </w:rPr>
+      </w:pPr>
+      <w:r>
+        <w:rPr>
+          <w:lang w:val="en-US"/>
+        </w:rPr>
+        <w:t>    desc</w:t>
+      </w:r>
+      <w:proofErr w:type="gramStart"/>
+      <w:r>
+        <w:rPr>
+          <w:lang w:val="en-US"/>
+        </w:rPr>
+        <w:t>=(</w:t>
+      </w:r>
+      <w:proofErr w:type="gramEnd"/>
+    </w:p>
+    <w:p>
+      <w:r>
+        <w:rPr>
+          <w:lang w:val="en-US"/>
+        </w:rPr>
+        <w:t xml:space="preserve">        </w:t>
+      </w:r>
+      <w:r>
+        <w:t xml:space="preserve">"Fragmentos textuales del </w:t>
+      </w:r>
+      <w:proofErr w:type="spellStart"/>
+      <w:r>
+        <w:t>prompt</w:t>
+      </w:r>
+      <w:proofErr w:type="spellEnd"/>
+      <w:r>
+        <w:t xml:space="preserve"> del usuario que no constituyen solicitudes."</w:t>
+      </w:r>
+    </w:p>
+    <w:p>
+      <w:r>
+        <w:t xml:space="preserve">        "No debe incluir explicaciones, interpretaciones, justificaciones ni </w:t>
+      </w:r>
+      <w:proofErr w:type="spellStart"/>
+      <w:r>
+        <w:t>metacomentarios</w:t>
+      </w:r>
+      <w:proofErr w:type="spellEnd"/>
+      <w:r>
+        <w:t xml:space="preserve"> del sistema."</w:t>
+      </w:r>
+    </w:p>
+    <w:p>
+      <w:r>
+        <w:t>        "El contenido debe presentarse como texto literal o parafraseado del usuario, sin análisis adicional."</w:t>
+      </w:r>
+    </w:p>
+    <w:p>
+      <w:r>
+        <w:t>        )</w:t>
+      </w:r>
+    </w:p>
+    <w:p>
+      <w:r>
+        <w:t>    )</w:t>
+      </w:r>
+    </w:p>
+    <w:p/>
+    <w:p/>
+    <w:p>
+      <w:pPr>
+        <w:pStyle w:val="Ttulo3"/>
+      </w:pPr>
+      <w:r>
+        <w:t>Resultado llama 3.1 8b (Local)</w:t>
+      </w:r>
+    </w:p>
+    <w:p>
+      <w:pPr>
+        <w:rPr>
+          <w:b/>
+          <w:bCs/>
+        </w:rPr>
+      </w:pPr>
+      <w:r>
+        <w:rPr>
+          <w:b/>
+          <w:bCs/>
+        </w:rPr>
+        <w:t>Las peticiones categorizadas fueron:</w:t>
+      </w:r>
+    </w:p>
+    <w:p>
+      <w:r>
+        <w:t>{'@1': {'solicitud': 'Consumo de nevera ayer por la noche', 'escenario': '</w:t>
+      </w:r>
+      <w:proofErr w:type="spellStart"/>
+      <w:r>
+        <w:t>consumo_basico</w:t>
+      </w:r>
+      <w:proofErr w:type="spellEnd"/>
+      <w:r>
+        <w:t>', 'formato': 'texto'}, '@2': {'solicitud': 'Consumo de lavadora el sábado pasado en la mañana', 'escenario': '</w:t>
+      </w:r>
+      <w:proofErr w:type="spellStart"/>
+      <w:r>
+        <w:t>consumo_basico</w:t>
+      </w:r>
+      <w:proofErr w:type="spellEnd"/>
+      <w:r>
+        <w:t>', 'formato': 'texto'}, '@3': {'solicitud': 'Comparación de consumo entre nevera y lavadora', 'escenario': '</w:t>
+      </w:r>
+      <w:proofErr w:type="spellStart"/>
+      <w:r>
+        <w:t>comparacion_consumos</w:t>
+      </w:r>
+      <w:proofErr w:type="spellEnd"/>
+      <w:r>
+        <w:t>', 'formato': 'mixto'}, '@4': {'solicitud': 'Consumo total de todos los dispositivos en el año 2024 con gráficas', 'escenario': '</w:t>
+      </w:r>
+      <w:proofErr w:type="spellStart"/>
+      <w:r>
+        <w:t>consumo_basico</w:t>
+      </w:r>
+      <w:proofErr w:type="spellEnd"/>
+      <w:r>
+        <w:t>', 'formato': 'grafico'}}</w:t>
+      </w:r>
+    </w:p>
+    <w:p>
+      <w:pPr>
+        <w:rPr>
+          <w:b/>
+          <w:bCs/>
+        </w:rPr>
+      </w:pPr>
+      <w:r>
+        <w:rPr>
+          <w:b/>
+          <w:bCs/>
+        </w:rPr>
+        <w:t>Las notas tomadas fueron:</w:t>
+      </w:r>
+    </w:p>
+    <w:p>
+      <w:r>
+        <w:t xml:space="preserve">Necesito saber cuánto consumió mi nevera ayer por la noche, y también cuánto consumió mi lavadora el sábado pasado en la mañana. </w:t>
+      </w:r>
+      <w:proofErr w:type="gramStart"/>
+      <w:r>
+        <w:t>Además</w:t>
+      </w:r>
+      <w:proofErr w:type="gramEnd"/>
+      <w:r>
+        <w:t xml:space="preserve"> quiero que me digas si entre esos dos días cuál gastó más energía.</w:t>
+      </w:r>
+    </w:p>
+    <w:p>
+      <w:pPr>
+        <w:pStyle w:val="Ttulo3"/>
+      </w:pPr>
+      <w:r>
+        <w:t xml:space="preserve">Resultado </w:t>
+      </w:r>
+      <w:proofErr w:type="spellStart"/>
+      <w:r>
+        <w:t>deepseek</w:t>
+      </w:r>
+      <w:proofErr w:type="spellEnd"/>
+      <w:r>
+        <w:t xml:space="preserve"> r1 8b (Local)</w:t>
+      </w:r>
+    </w:p>
+    <w:p>
+      <w:pPr>
+        <w:rPr>
+          <w:b/>
+          <w:bCs/>
+        </w:rPr>
+      </w:pPr>
+      <w:r>
+        <w:rPr>
+          <w:b/>
+          <w:bCs/>
+        </w:rPr>
+        <w:t>Las peticiones categorizadas fueron:</w:t>
+      </w:r>
+    </w:p>
+    <w:p>
+      <w:r>
+        <w:t>{'@1': {'solicitud': 'Consultar el consumo energético de la nevera ayer por la noche.', 'escenario': '</w:t>
+      </w:r>
+      <w:proofErr w:type="spellStart"/>
+      <w:r>
+        <w:t>consumo_basico</w:t>
+      </w:r>
+      <w:proofErr w:type="spellEnd"/>
+      <w:r>
+        <w:t>', 'formato': '</w:t>
+      </w:r>
+      <w:proofErr w:type="spellStart"/>
+      <w:r>
+        <w:t>no_especificado</w:t>
+      </w:r>
+      <w:proofErr w:type="spellEnd"/>
+      <w:r>
+        <w:t>'}, '@2': {'solicitud': 'Consultar el consumo energético de la lavadora el sábado pasado en la mañana.', 'escenario': '</w:t>
+      </w:r>
+      <w:proofErr w:type="spellStart"/>
+      <w:r>
+        <w:t>consumo_basico</w:t>
+      </w:r>
+      <w:proofErr w:type="spellEnd"/>
+      <w:r>
+        <w:t>', 'formato': '</w:t>
+      </w:r>
+      <w:proofErr w:type="spellStart"/>
+      <w:r>
+        <w:t>no_especificado</w:t>
+      </w:r>
+      <w:proofErr w:type="spellEnd"/>
+      <w:r>
+        <w:t>'}, '@3': {'solicitud': 'Comparar los consumos de la nevera y la lavadora entre ayer por la noche y el sábado pasado en la mañana.', 'escenario': '</w:t>
+      </w:r>
+      <w:proofErr w:type="spellStart"/>
+      <w:r>
+        <w:t>comparacion_consumos</w:t>
+      </w:r>
+      <w:proofErr w:type="spellEnd"/>
+      <w:r>
+        <w:t>', 'formato': '</w:t>
+      </w:r>
+      <w:proofErr w:type="spellStart"/>
+      <w:r>
+        <w:t>no_especificado</w:t>
+      </w:r>
+      <w:proofErr w:type="spellEnd"/>
+      <w:r>
+        <w:t>'}, '@4': {'solicitud': 'Obtener un informe detallado del consumo energético de todos los dispositivos durante el año 2024, incluyendo gráficos de la evolución diaria y mensual.', 'escenario': '</w:t>
+      </w:r>
+      <w:proofErr w:type="spellStart"/>
+      <w:r>
+        <w:t>comparacion_consumos</w:t>
+      </w:r>
+      <w:proofErr w:type="spellEnd"/>
+      <w:r>
+        <w:t>', 'formato': 'grafico'}}</w:t>
+      </w:r>
+    </w:p>
+    <w:p>
+      <w:pPr>
+        <w:rPr>
+          <w:b/>
+          <w:bCs/>
+        </w:rPr>
+      </w:pPr>
+      <w:r>
+        <w:rPr>
+          <w:b/>
+          <w:bCs/>
+        </w:rPr>
+        <w:t>Las notas tomadas fueron:</w:t>
+      </w:r>
+    </w:p>
+    <w:p>
+      <w:r>
+        <w:t>Mientras miraba los consumos de la nevera y la lavadora, se me descargó el celular y me dio mucha pereza pararme a buscar el cargador. Papá también pidió que le dijeras cuánto fue el consumo de todos los dispositivos en el año 2024.</w:t>
+      </w:r>
+    </w:p>
+    <w:p>
+      <w:pPr>
+        <w:pStyle w:val="Ttulo3"/>
+      </w:pPr>
+      <w:r>
+        <w:t>Resultado Gemma 7b (Local)</w:t>
+      </w:r>
+    </w:p>
+    <w:p>
+      <w:pPr>
+        <w:rPr>
+          <w:b/>
+          <w:bCs/>
+        </w:rPr>
+      </w:pPr>
+      <w:r>
+        <w:rPr>
+          <w:b/>
+          <w:bCs/>
+        </w:rPr>
+        <w:t>Las peticiones categorizadas fueron:</w:t>
+      </w:r>
+    </w:p>
+    <w:p>
+      <w:r>
+        <w:t>{'1': {'solicitud': 'Consumir consumo energético de la nevera ayer por la noche y la lavadora el sábado pasado por la mañana.', 'escenario': '</w:t>
+      </w:r>
+      <w:proofErr w:type="spellStart"/>
+      <w:r>
+        <w:t>consumo_basico</w:t>
+      </w:r>
+      <w:proofErr w:type="spellEnd"/>
+      <w:r>
+        <w:t>', 'formato': 'texto'}, '2': {'solicitud': 'Identificar cuál dispositivo consumió más energía entre ayer por la noche y el sábado pasado por la mañana.', 'escenario': '</w:t>
+      </w:r>
+      <w:proofErr w:type="spellStart"/>
+      <w:r>
+        <w:t>comparacion_consumos</w:t>
+      </w:r>
+      <w:proofErr w:type="spellEnd"/>
+      <w:r>
+        <w:t>', 'formato': 'texto'}, '3': {'solicitud': 'Mostrar los consumos de todos los dispositivos en el año 2024 en gráfica.', 'escenario': '</w:t>
+      </w:r>
+      <w:proofErr w:type="spellStart"/>
+      <w:r>
+        <w:t>prediccion_estimacion</w:t>
+      </w:r>
+      <w:proofErr w:type="spellEnd"/>
+      <w:r>
+        <w:t>', 'formato': 'grafico'}, '4': {'solicitud': 'Explique la descarga del celular y la búsqueda del cargador.', 'escenario': '</w:t>
       </w:r>
       <w:proofErr w:type="spellStart"/>
       <w:r>
@@ -3656,89 +4257,86 @@
       </w:r>
       <w:proofErr w:type="spellEnd"/>
       <w:r>
-        <w:t xml:space="preserve">, su inclusión en la documentación responde a criterios de </w:t>
-      </w:r>
-      <w:r>
-        <w:rPr>
-          <w:b/>
-          <w:bCs/>
-        </w:rPr>
-        <w:t>escalabilidad y extensibilidad del sistema</w:t>
-      </w:r>
-      <w:r>
-        <w:t>, permitiendo reconocer explícitamente este tipo de intención y facilitar su integración futura sin afectar la coherencia del pipeline existente.</w:t>
-      </w:r>
-    </w:p>
-    <w:p>
-      <w:r>
-        <w:rPr>
-          <w:b/>
-          <w:bCs/>
-        </w:rPr>
-        <w:t xml:space="preserve">3) </w:t>
-      </w:r>
-      <w:r>
-        <w:t xml:space="preserve">Se retiró el modelo </w:t>
-      </w:r>
-      <w:proofErr w:type="spellStart"/>
-      <w:r>
-        <w:t>Qwen</w:t>
-      </w:r>
-      <w:proofErr w:type="spellEnd"/>
-      <w:r>
-        <w:t xml:space="preserve"> 3 </w:t>
-      </w:r>
-      <w:r>
-        <w:t xml:space="preserve">de </w:t>
-      </w:r>
-      <w:r>
-        <w:t>4</w:t>
-      </w:r>
-      <w:r>
-        <w:t xml:space="preserve"> billones de parámetros </w:t>
-      </w:r>
-      <w:r>
-        <w:t>debido</w:t>
-      </w:r>
-      <w:r>
-        <w:t xml:space="preserve"> a</w:t>
-      </w:r>
-      <w:r>
-        <w:t xml:space="preserve"> salida de respuestas no legibles e imposibilidad de adaptarlo al esquema propuesto sin ningún </w:t>
-      </w:r>
-      <w:proofErr w:type="spellStart"/>
-      <w:r>
-        <w:t>pre-procesamiento</w:t>
-      </w:r>
-      <w:proofErr w:type="spellEnd"/>
-      <w:r>
-        <w:t xml:space="preserve"> adicional.</w:t>
-      </w:r>
-      <w:r>
-        <w:t xml:space="preserve"> </w:t>
-      </w:r>
-    </w:p>
-    <w:p>
-      <w:pPr>
-        <w:rPr>
-          <w:b/>
-          <w:bCs/>
-        </w:rPr>
-      </w:pPr>
+        <w:t>', 'formato': '</w:t>
+      </w:r>
+      <w:proofErr w:type="spellStart"/>
+      <w:r>
+        <w:t>no_especificado</w:t>
+      </w:r>
+      <w:proofErr w:type="spellEnd"/>
+      <w:r>
+        <w:t>'}}</w:t>
+      </w:r>
+    </w:p>
+    <w:p>
+      <w:pPr>
+        <w:rPr>
+          <w:b/>
+          <w:bCs/>
+        </w:rPr>
+      </w:pPr>
+      <w:r>
+        <w:rPr>
+          <w:b/>
+          <w:bCs/>
+        </w:rPr>
+        <w:t>Las notas tomadas fueron:</w:t>
+      </w:r>
+    </w:p>
+    <w:p>
+      <w:r>
+        <w:t>= "Se encontraron preguntas sobre consumo energético, picos de consumo y gráficos de consumo."</w:t>
+      </w:r>
     </w:p>
     <w:p>
       <w:pPr>
         <w:pStyle w:val="Ttulo3"/>
       </w:pPr>
-      <w:proofErr w:type="spellStart"/>
-      <w:r>
-        <w:t>Signature</w:t>
-      </w:r>
-      <w:proofErr w:type="spellEnd"/>
-    </w:p>
-    <w:p>
-      <w:r>
-        <w:t>Permanece igual a la segunda prueba.</w:t>
+      <w:r>
+        <w:t>Resultado Mistral 7b (Local)</w:t>
+      </w:r>
+    </w:p>
+    <w:p>
+      <w:pPr>
+        <w:rPr>
+          <w:lang w:val="en-US"/>
+        </w:rPr>
+      </w:pPr>
+      <w:r>
+        <w:rPr>
+          <w:lang w:val="en-US"/>
+        </w:rPr>
+        <w:t xml:space="preserve">2025/12/22 15:29:39 WARNING </w:t>
+      </w:r>
+      <w:proofErr w:type="spellStart"/>
+      <w:proofErr w:type="gramStart"/>
+      <w:r>
+        <w:rPr>
+          <w:lang w:val="en-US"/>
+        </w:rPr>
+        <w:t>dspy.adapters</w:t>
+      </w:r>
+      <w:proofErr w:type="gramEnd"/>
+      <w:r>
+        <w:rPr>
+          <w:lang w:val="en-US"/>
+        </w:rPr>
+        <w:t>.json_adapter</w:t>
+      </w:r>
+      <w:proofErr w:type="spellEnd"/>
+      <w:r>
+        <w:rPr>
+          <w:lang w:val="en-US"/>
+        </w:rPr>
+        <w:t>: Failed to use structured output format, falling back to JSON mode.</w:t>
+      </w:r>
+    </w:p>
+    <w:p>
+      <w:r>
+        <w:t>La</w:t>
+      </w:r>
+      <w:r>
+        <w:t xml:space="preserve"> respuesta del modelo no se adaptó al formato de salida esperado, revisando mejor las salidas, se encontró que arrojaba los escenarios de entrada como listas.</w:t>
       </w:r>
     </w:p>
     <w:p>
@@ -3746,8 +4344,87 @@
         <w:pStyle w:val="Ttulo3"/>
       </w:pPr>
       <w:r>
-        <w:lastRenderedPageBreak/>
-        <w:t>Resultados</w:t>
+        <w:t>Resultado Qwen3 4b (Local)</w:t>
+      </w:r>
+    </w:p>
+    <w:p>
+      <w:pPr>
+        <w:rPr>
+          <w:b/>
+          <w:bCs/>
+        </w:rPr>
+      </w:pPr>
+      <w:r>
+        <w:rPr>
+          <w:b/>
+          <w:bCs/>
+        </w:rPr>
+        <w:t>Las peticiones categorizadas fueron:</w:t>
+      </w:r>
+    </w:p>
+    <w:p>
+      <w:r>
+        <w:t>{'@1': {'solicitud': 'Consultar el consumo energético de la nevera el día anterior (ayer por la noche)', 'escenario': '</w:t>
+      </w:r>
+      <w:proofErr w:type="spellStart"/>
+      <w:r>
+        <w:t>consumo_basico</w:t>
+      </w:r>
+      <w:proofErr w:type="spellEnd"/>
+      <w:r>
+        <w:t>', 'formato': 'texto'}, '@2': {'solicitud': 'Consultar el consumo energético de la lavadora el sábado pasado (mañana)', '</w:t>
+      </w:r>
+      <w:proofErr w:type="spellStart"/>
+      <w:r>
+        <w:t>esc:enario</w:t>
+      </w:r>
+      <w:proofErr w:type="spellEnd"/>
+      <w:r>
+        <w:t>': '</w:t>
+      </w:r>
+      <w:proofErr w:type="spellStart"/>
+      <w:r>
+        <w:t>consumo_basico</w:t>
+      </w:r>
+      <w:proofErr w:type="spellEnd"/>
+      <w:r>
+        <w:t>', 'formato': 'texto'}, '@3': {'solicitud': 'Comparar el consumo energético entre la nevera y la lavadora para determinar cuál gastó más energía en los dos días mencionados', 'escenario': '</w:t>
+      </w:r>
+      <w:proofErr w:type="spellStart"/>
+      <w:r>
+        <w:t>comparacion_consumos</w:t>
+      </w:r>
+      <w:proofErr w:type="spellEnd"/>
+      <w:r>
+        <w:t>', 'formato': 'texto'}, '@4': {'solicitud': 'Generar gráficas de consumo energético para todos los dispositivos del año 2024', 'escenario': '</w:t>
+      </w:r>
+      <w:proofErr w:type="spellStart"/>
+      <w:r>
+        <w:t>deteccion_anomalias_tendencias</w:t>
+      </w:r>
+      <w:proofErr w:type="spellEnd"/>
+      <w:r>
+        <w:t>', 'formato': 'grafico'}}</w:t>
+      </w:r>
+    </w:p>
+    <w:p>
+      <w:pPr>
+        <w:rPr>
+          <w:b/>
+          <w:bCs/>
+        </w:rPr>
+      </w:pPr>
+      <w:r>
+        <w:rPr>
+          <w:b/>
+          <w:bCs/>
+        </w:rPr>
+        <w:t>Las notas tomadas fueron:</w:t>
+      </w:r>
+    </w:p>
+    <w:p>
+      <w:r>
+        <w:t>me dio mucha pereza pararme a buscar el cargador</w:t>
       </w:r>
     </w:p>
     <w:p>
@@ -3755,7 +4432,21 @@
         <w:pStyle w:val="Ttulo3"/>
       </w:pPr>
       <w:r>
-        <w:t>Resultado llama 3.1 8b (Local)</w:t>
+        <w:t xml:space="preserve">Resultado </w:t>
+      </w:r>
+      <w:r>
+        <w:t xml:space="preserve">Llama 3.3 70b </w:t>
+      </w:r>
+      <w:r>
+        <w:t>(</w:t>
+      </w:r>
+      <w:proofErr w:type="spellStart"/>
+      <w:r>
+        <w:t>OpenRouter</w:t>
+      </w:r>
+      <w:proofErr w:type="spellEnd"/>
+      <w:r>
+        <w:t>)</w:t>
       </w:r>
     </w:p>
     <w:p>
@@ -3774,6 +4465,59 @@
       </w:r>
     </w:p>
     <w:p>
+      <w:r>
+        <w:t>{'@1': {'solicitud': 'Consumo de la nevera ayer por la noche', 'escenario': '</w:t>
+      </w:r>
+      <w:proofErr w:type="spellStart"/>
+      <w:r>
+        <w:t>consumo_basico</w:t>
+      </w:r>
+      <w:proofErr w:type="spellEnd"/>
+      <w:r>
+        <w:t>', 'formato': '</w:t>
+      </w:r>
+      <w:proofErr w:type="spellStart"/>
+      <w:r>
+        <w:t>no_especificado</w:t>
+      </w:r>
+      <w:proofErr w:type="spellEnd"/>
+      <w:r>
+        <w:t>'}, '@2': {'solicitud': 'Consumo de la lavadora el sábado pasado en la mañana', 'escenario': '</w:t>
+      </w:r>
+      <w:proofErr w:type="spellStart"/>
+      <w:r>
+        <w:t>consumo_basico</w:t>
+      </w:r>
+      <w:proofErr w:type="spellEnd"/>
+      <w:r>
+        <w:t>', 'formato': '</w:t>
+      </w:r>
+      <w:proofErr w:type="spellStart"/>
+      <w:r>
+        <w:t>no_especificado</w:t>
+      </w:r>
+      <w:proofErr w:type="spellEnd"/>
+      <w:r>
+        <w:t>'}, '@3': {'solicitud': 'Comparación de consumos entre la nevera y la lavadora', 'escenario': '</w:t>
+      </w:r>
+      <w:proofErr w:type="spellStart"/>
+      <w:r>
+        <w:t>comparacion_consumos</w:t>
+      </w:r>
+      <w:proofErr w:type="spellEnd"/>
+      <w:r>
+        <w:t>', 'formato': 'mixto'}, '@4': {'solicitud': 'Consumo total de todos los dispositivos en el año 2024', 'escenario': '</w:t>
+      </w:r>
+      <w:proofErr w:type="spellStart"/>
+      <w:r>
+        <w:t>consumo_basico</w:t>
+      </w:r>
+      <w:proofErr w:type="spellEnd"/>
+      <w:r>
+        <w:t>', 'formato': 'grafico'}}</w:t>
+      </w:r>
+    </w:p>
+    <w:p>
       <w:pPr>
         <w:rPr>
           <w:b/>
@@ -3789,347 +4533,8 @@
       </w:r>
     </w:p>
     <w:p>
-      <w:pPr>
-        <w:pStyle w:val="Ttulo3"/>
-      </w:pPr>
-      <w:r>
-        <w:t xml:space="preserve">Resultado </w:t>
-      </w:r>
-      <w:proofErr w:type="spellStart"/>
-      <w:r>
-        <w:t>deepseek</w:t>
-      </w:r>
-      <w:proofErr w:type="spellEnd"/>
-      <w:r>
-        <w:t xml:space="preserve"> r1 8b (Local)</w:t>
-      </w:r>
-    </w:p>
-    <w:p>
-      <w:pPr>
-        <w:rPr>
-          <w:b/>
-          <w:bCs/>
-        </w:rPr>
-      </w:pPr>
-      <w:r>
-        <w:rPr>
-          <w:b/>
-          <w:bCs/>
-        </w:rPr>
-        <w:t>Las peticiones categorizadas fueron:</w:t>
-      </w:r>
-    </w:p>
-    <w:p>
-      <w:pPr>
-        <w:rPr>
-          <w:b/>
-          <w:bCs/>
-        </w:rPr>
-      </w:pPr>
-      <w:r>
-        <w:rPr>
-          <w:b/>
-          <w:bCs/>
-        </w:rPr>
-        <w:t>Las notas tomadas fueron:</w:t>
-      </w:r>
-    </w:p>
-    <w:p>
-      <w:pPr>
-        <w:pStyle w:val="Ttulo3"/>
-      </w:pPr>
-      <w:r>
-        <w:t>Resultado Gemma 7b (Local)</w:t>
-      </w:r>
-    </w:p>
-    <w:p>
-      <w:pPr>
-        <w:rPr>
-          <w:b/>
-          <w:bCs/>
-        </w:rPr>
-      </w:pPr>
-      <w:r>
-        <w:rPr>
-          <w:b/>
-          <w:bCs/>
-        </w:rPr>
-        <w:t>Las peticiones categorizadas fueron:</w:t>
-      </w:r>
-    </w:p>
-    <w:p>
-      <w:pPr>
-        <w:rPr>
-          <w:b/>
-          <w:bCs/>
-        </w:rPr>
-      </w:pPr>
-      <w:r>
-        <w:rPr>
-          <w:b/>
-          <w:bCs/>
-        </w:rPr>
-        <w:t>Las notas tomadas fueron:</w:t>
-      </w:r>
-    </w:p>
-    <w:p>
-      <w:pPr>
-        <w:pStyle w:val="Ttulo3"/>
-      </w:pPr>
-      <w:r>
-        <w:t>Resultado Mistral 7b (Local)</w:t>
-      </w:r>
-    </w:p>
-    <w:p>
-      <w:pPr>
-        <w:rPr>
-          <w:b/>
-          <w:bCs/>
-        </w:rPr>
-      </w:pPr>
-      <w:r>
-        <w:rPr>
-          <w:b/>
-          <w:bCs/>
-        </w:rPr>
-        <w:t>Las peticiones categorizadas fueron:</w:t>
-      </w:r>
-    </w:p>
-    <w:p>
-      <w:pPr>
-        <w:rPr>
-          <w:b/>
-          <w:bCs/>
-        </w:rPr>
-      </w:pPr>
-      <w:r>
-        <w:rPr>
-          <w:b/>
-          <w:bCs/>
-        </w:rPr>
-        <w:t>Las notas tomadas fueron:</w:t>
-      </w:r>
-    </w:p>
-    <w:p>
-      <w:pPr>
-        <w:pStyle w:val="Ttulo3"/>
-      </w:pPr>
-      <w:r>
-        <w:t>Resultado Qwen3 4b (Local)</w:t>
-      </w:r>
-    </w:p>
-    <w:p>
-      <w:pPr>
-        <w:pStyle w:val="Ttulo3"/>
-      </w:pPr>
-      <w:r>
-        <w:t xml:space="preserve">Resultado </w:t>
-      </w:r>
-      <w:r>
-        <w:t xml:space="preserve">Llama 3.3 70b </w:t>
-      </w:r>
-      <w:r>
-        <w:t>(</w:t>
-      </w:r>
-      <w:proofErr w:type="spellStart"/>
-      <w:r>
-        <w:t>OpenRouter</w:t>
-      </w:r>
-      <w:proofErr w:type="spellEnd"/>
-      <w:r>
-        <w:t>)</w:t>
-      </w:r>
-    </w:p>
-    <w:p>
-      <w:pPr>
-        <w:rPr>
-          <w:b/>
-          <w:bCs/>
-        </w:rPr>
-      </w:pPr>
-      <w:r>
-        <w:rPr>
-          <w:b/>
-          <w:bCs/>
-        </w:rPr>
-        <w:t>Las peticiones categorizadas fueron:</w:t>
-      </w:r>
-    </w:p>
-    <w:p>
-      <w:pPr>
-        <w:rPr>
-          <w:b/>
-          <w:bCs/>
-        </w:rPr>
-      </w:pPr>
-      <w:r>
-        <w:rPr>
-          <w:b/>
-          <w:bCs/>
-        </w:rPr>
-        <w:t>Las notas tomadas fueron:</w:t>
-      </w:r>
-    </w:p>
-    <w:p>
-      <w:pPr>
-        <w:pStyle w:val="Ttulo3"/>
-      </w:pPr>
-      <w:r>
-        <w:t xml:space="preserve">Resultado </w:t>
-      </w:r>
-      <w:r>
-        <w:t xml:space="preserve">Gemini 2.0 Flash </w:t>
-      </w:r>
-      <w:r>
-        <w:t>experimental (</w:t>
-      </w:r>
-      <w:proofErr w:type="spellStart"/>
-      <w:r>
-        <w:t>OpenRouter</w:t>
-      </w:r>
-      <w:proofErr w:type="spellEnd"/>
-      <w:r>
-        <w:t>)</w:t>
-      </w:r>
-    </w:p>
-    <w:p>
-      <w:pPr>
-        <w:rPr>
-          <w:b/>
-          <w:bCs/>
-        </w:rPr>
-      </w:pPr>
-      <w:r>
-        <w:rPr>
-          <w:b/>
-          <w:bCs/>
-        </w:rPr>
-        <w:t>Las peticiones categorizadas fueron:</w:t>
-      </w:r>
-    </w:p>
-    <w:p>
-      <w:pPr>
-        <w:rPr>
-          <w:b/>
-          <w:bCs/>
-        </w:rPr>
-      </w:pPr>
-      <w:r>
-        <w:rPr>
-          <w:b/>
-          <w:bCs/>
-        </w:rPr>
-        <w:t>Las notas tomadas fueron:</w:t>
-      </w:r>
-    </w:p>
-    <w:p>
-      <w:pPr>
-        <w:pStyle w:val="Ttulo3"/>
-      </w:pPr>
-      <w:r>
-        <w:t xml:space="preserve">Resultado </w:t>
-      </w:r>
-      <w:r>
-        <w:t>Mistral Devstral2</w:t>
-      </w:r>
-      <w:r>
-        <w:t xml:space="preserve"> </w:t>
-      </w:r>
-      <w:r>
-        <w:t xml:space="preserve">123b </w:t>
-      </w:r>
-      <w:r>
-        <w:t>(</w:t>
-      </w:r>
-      <w:proofErr w:type="spellStart"/>
-      <w:r>
-        <w:t>OpenRouter</w:t>
-      </w:r>
-      <w:proofErr w:type="spellEnd"/>
-      <w:r>
-        <w:t>)</w:t>
-      </w:r>
-    </w:p>
-    <w:p>
-      <w:pPr>
-        <w:rPr>
-          <w:b/>
-          <w:bCs/>
-        </w:rPr>
-      </w:pPr>
-      <w:r>
-        <w:rPr>
-          <w:b/>
-          <w:bCs/>
-        </w:rPr>
-        <w:t>Las peticiones categorizadas fueron:</w:t>
-      </w:r>
-    </w:p>
-    <w:p>
-      <w:pPr>
-        <w:rPr>
-          <w:b/>
-          <w:bCs/>
-        </w:rPr>
-      </w:pPr>
-      <w:r>
-        <w:rPr>
-          <w:b/>
-          <w:bCs/>
-        </w:rPr>
-        <w:t>Las notas tomadas fueron:</w:t>
-      </w:r>
-    </w:p>
-    <w:p>
-      <w:pPr>
-        <w:pStyle w:val="Ttulo3"/>
-      </w:pPr>
-      <w:r>
-        <w:t xml:space="preserve">Resultado </w:t>
-      </w:r>
-      <w:r>
-        <w:t xml:space="preserve">Xiaomi MimoV2 Flash 15b 309b </w:t>
-      </w:r>
-      <w:r>
-        <w:t>(</w:t>
-      </w:r>
-      <w:proofErr w:type="spellStart"/>
-      <w:r>
-        <w:t>OpenRouter</w:t>
-      </w:r>
-      <w:proofErr w:type="spellEnd"/>
-      <w:r>
-        <w:t>)</w:t>
-      </w:r>
-    </w:p>
-    <w:p>
-      <w:pPr>
-        <w:rPr>
-          <w:b/>
-          <w:bCs/>
-        </w:rPr>
-      </w:pPr>
-      <w:r>
-        <w:rPr>
-          <w:b/>
-          <w:bCs/>
-        </w:rPr>
-        <w:t>Las peticiones categorizadas fueron:</w:t>
-      </w:r>
-    </w:p>
-    <w:p>
-      <w:pPr>
-        <w:rPr>
-          <w:b/>
-          <w:bCs/>
-        </w:rPr>
-      </w:pPr>
-      <w:r>
-        <w:rPr>
-          <w:b/>
-          <w:bCs/>
-        </w:rPr>
-        <w:t>Las notas tomadas fueron:</w:t>
+      <w:r>
+        <w:t>El usuario mencionó que se le descargó el celular y no quiso pararse a buscar el cargador, pero esto no está relacionado con las solicitudes de consumo energético.</w:t>
       </w:r>
     </w:p>
     <w:p>
@@ -4140,6 +4545,390 @@
         <w:lastRenderedPageBreak/>
         <w:t xml:space="preserve">Resultado </w:t>
       </w:r>
+      <w:r>
+        <w:t xml:space="preserve">Gemini 2.0 Flash </w:t>
+      </w:r>
+      <w:r>
+        <w:t>experimental (</w:t>
+      </w:r>
+      <w:proofErr w:type="spellStart"/>
+      <w:r>
+        <w:t>OpenRouter</w:t>
+      </w:r>
+      <w:proofErr w:type="spellEnd"/>
+      <w:r>
+        <w:t>)</w:t>
+      </w:r>
+    </w:p>
+    <w:p>
+      <w:pPr>
+        <w:rPr>
+          <w:b/>
+          <w:bCs/>
+        </w:rPr>
+      </w:pPr>
+      <w:r>
+        <w:rPr>
+          <w:b/>
+          <w:bCs/>
+        </w:rPr>
+        <w:t>Las peticiones categorizadas fueron:</w:t>
+      </w:r>
+    </w:p>
+    <w:p>
+      <w:r>
+        <w:t>{'@1': {'solicitud': 'Consultar el consumo de la nevera durante la noche de ayer.', 'escenario': '</w:t>
+      </w:r>
+      <w:proofErr w:type="spellStart"/>
+      <w:r>
+        <w:t>consumo_basico</w:t>
+      </w:r>
+      <w:proofErr w:type="spellEnd"/>
+      <w:r>
+        <w:t>', 'formato': '</w:t>
+      </w:r>
+      <w:proofErr w:type="spellStart"/>
+      <w:r>
+        <w:t>no_especificado</w:t>
+      </w:r>
+      <w:proofErr w:type="spellEnd"/>
+      <w:r>
+        <w:t>'}, '@2': {'solicitud': 'Consultar el consumo de la lavadora durante la mañana del sábado pasado.', 'escenario': '</w:t>
+      </w:r>
+      <w:proofErr w:type="spellStart"/>
+      <w:r>
+        <w:t>consumo_basico</w:t>
+      </w:r>
+      <w:proofErr w:type="spellEnd"/>
+      <w:r>
+        <w:t>', 'formato': '</w:t>
+      </w:r>
+      <w:proofErr w:type="spellStart"/>
+      <w:r>
+        <w:t>no_especificado</w:t>
+      </w:r>
+      <w:proofErr w:type="spellEnd"/>
+      <w:r>
+        <w:t>'}, '@3': {'solicitud': 'Comparar el consumo de la nevera durante la noche de ayer con el consumo de la lavadora durante la mañana del sábado pasado para determinar cuál consumió más energía.', 'escenario': '</w:t>
+      </w:r>
+      <w:proofErr w:type="spellStart"/>
+      <w:r>
+        <w:t>comparacion_consumos</w:t>
+      </w:r>
+      <w:proofErr w:type="spellEnd"/>
+      <w:r>
+        <w:t>', 'formato': 'texto'}, '@4': {'solicitud': 'Consultar el consumo total de todos los dispositivos en el año 2024.', 'escenario': '</w:t>
+      </w:r>
+      <w:proofErr w:type="spellStart"/>
+      <w:r>
+        <w:t>consumo_basico</w:t>
+      </w:r>
+      <w:proofErr w:type="spellEnd"/>
+      <w:r>
+        <w:t>', 'formato': 'grafico'}, '@5': {'solicitud': 'Mostrar gráficas de todos los consumos que se puedan.', 'escenario': '</w:t>
+      </w:r>
+      <w:proofErr w:type="spellStart"/>
+      <w:r>
+        <w:t>consumo_basico</w:t>
+      </w:r>
+      <w:proofErr w:type="spellEnd"/>
+      <w:r>
+        <w:t>', 'formato': 'grafico'}}</w:t>
+      </w:r>
+    </w:p>
+    <w:p>
+      <w:pPr>
+        <w:rPr>
+          <w:b/>
+          <w:bCs/>
+        </w:rPr>
+      </w:pPr>
+      <w:r>
+        <w:rPr>
+          <w:b/>
+          <w:bCs/>
+        </w:rPr>
+        <w:t>Las notas tomadas fueron:</w:t>
+      </w:r>
+    </w:p>
+    <w:p>
+      <w:r>
+        <w:t xml:space="preserve">"se me descargó el celular y me dio mucha pereza pararme a buscar el cargador, pero igual quiero la </w:t>
+      </w:r>
+      <w:proofErr w:type="spellStart"/>
+      <w:proofErr w:type="gramStart"/>
+      <w:r>
+        <w:t>comparación.Papá</w:t>
+      </w:r>
+      <w:proofErr w:type="spellEnd"/>
+      <w:proofErr w:type="gramEnd"/>
+      <w:r>
+        <w:t xml:space="preserve"> también pidió que le dijeras cuánto fue el consumo de todos los dispositivos en el año 2024"</w:t>
+      </w:r>
+    </w:p>
+    <w:p>
+      <w:pPr>
+        <w:pStyle w:val="Ttulo3"/>
+      </w:pPr>
+      <w:r>
+        <w:t xml:space="preserve">Resultado </w:t>
+      </w:r>
+      <w:r>
+        <w:t>Mistral Devstral2</w:t>
+      </w:r>
+      <w:r>
+        <w:t xml:space="preserve"> </w:t>
+      </w:r>
+      <w:r>
+        <w:t xml:space="preserve">123b </w:t>
+      </w:r>
+      <w:r>
+        <w:t>(</w:t>
+      </w:r>
+      <w:proofErr w:type="spellStart"/>
+      <w:r>
+        <w:t>OpenRouter</w:t>
+      </w:r>
+      <w:proofErr w:type="spellEnd"/>
+      <w:r>
+        <w:t>)</w:t>
+      </w:r>
+    </w:p>
+    <w:p>
+      <w:pPr>
+        <w:rPr>
+          <w:b/>
+          <w:bCs/>
+        </w:rPr>
+      </w:pPr>
+      <w:r>
+        <w:rPr>
+          <w:b/>
+          <w:bCs/>
+        </w:rPr>
+        <w:t>Las peticiones categorizadas fueron:</w:t>
+      </w:r>
+    </w:p>
+    <w:p>
+      <w:r>
+        <w:t>{'@1': {'solicitud': 'Consultar el consumo energético de la nevera ayer por la noche.', 'escenario': '</w:t>
+      </w:r>
+      <w:proofErr w:type="spellStart"/>
+      <w:r>
+        <w:t>consumo_basico</w:t>
+      </w:r>
+      <w:proofErr w:type="spellEnd"/>
+      <w:r>
+        <w:t>', 'formato': '</w:t>
+      </w:r>
+      <w:proofErr w:type="spellStart"/>
+      <w:r>
+        <w:t>no_especificado</w:t>
+      </w:r>
+      <w:proofErr w:type="spellEnd"/>
+      <w:r>
+        <w:t>'}, '@2': {'solicitud': 'Consultar el consumo energético de la lavadora el sábado pasado en la mañana.', 'escenario': '</w:t>
+      </w:r>
+      <w:proofErr w:type="spellStart"/>
+      <w:r>
+        <w:t>consumo_basico</w:t>
+      </w:r>
+      <w:proofErr w:type="spellEnd"/>
+      <w:r>
+        <w:t>', 'formato': '</w:t>
+      </w:r>
+      <w:proofErr w:type="spellStart"/>
+      <w:r>
+        <w:t>no_especificado</w:t>
+      </w:r>
+      <w:proofErr w:type="spellEnd"/>
+      <w:r>
+        <w:t>'}, '@3': {'solicitud': 'Comparar el consumo energético de la nevera y la lavadora entre los dos días mencionados para determinar cuál gastó más energía.', 'escenario': '</w:t>
+      </w:r>
+      <w:proofErr w:type="spellStart"/>
+      <w:r>
+        <w:t>comparacion_consumos</w:t>
+      </w:r>
+      <w:proofErr w:type="spellEnd"/>
+      <w:r>
+        <w:t>', 'formato': '</w:t>
+      </w:r>
+      <w:proofErr w:type="spellStart"/>
+      <w:r>
+        <w:t>no_especificado</w:t>
+      </w:r>
+      <w:proofErr w:type="spellEnd"/>
+      <w:r>
+        <w:t>'}, '@4': {'solicitud': 'Consultar el consumo energético de todos los dispositivos en el año 2024.', 'escenario': '</w:t>
+      </w:r>
+      <w:proofErr w:type="spellStart"/>
+      <w:r>
+        <w:t>consumo_basico</w:t>
+      </w:r>
+      <w:proofErr w:type="spellEnd"/>
+      <w:r>
+        <w:t>', 'formato': 'grafico'}}</w:t>
+      </w:r>
+    </w:p>
+    <w:p>
+      <w:pPr>
+        <w:rPr>
+          <w:b/>
+          <w:bCs/>
+        </w:rPr>
+      </w:pPr>
+      <w:r>
+        <w:rPr>
+          <w:b/>
+          <w:bCs/>
+        </w:rPr>
+        <w:t>Las notas tomadas fueron:</w:t>
+      </w:r>
+    </w:p>
+    <w:p>
+      <w:r>
+        <w:t>"Mientras miraba esos consumos se me descargó el celular y me dio mucha pereza pararme a buscar el cargador, pero igual quiero la comparación. Papá también pidió que le dijeras cuánto fue el consumo de todos los dispositivos en el año 2024, quiero ver gráficas de todo lo que se pueda."</w:t>
+      </w:r>
+    </w:p>
+    <w:p>
+      <w:pPr>
+        <w:pStyle w:val="Ttulo3"/>
+        <w:rPr>
+          <w:lang w:val="en-US"/>
+        </w:rPr>
+      </w:pPr>
+      <w:proofErr w:type="spellStart"/>
+      <w:r>
+        <w:rPr>
+          <w:lang w:val="en-US"/>
+        </w:rPr>
+        <w:t>Resultado</w:t>
+      </w:r>
+      <w:proofErr w:type="spellEnd"/>
+      <w:r>
+        <w:rPr>
+          <w:lang w:val="en-US"/>
+        </w:rPr>
+        <w:t xml:space="preserve"> Xiaomi MimoV2 Flash 15b 309b (</w:t>
+      </w:r>
+      <w:proofErr w:type="spellStart"/>
+      <w:r>
+        <w:rPr>
+          <w:lang w:val="en-US"/>
+        </w:rPr>
+        <w:t>OpenRouter</w:t>
+      </w:r>
+      <w:proofErr w:type="spellEnd"/>
+      <w:r>
+        <w:rPr>
+          <w:lang w:val="en-US"/>
+        </w:rPr>
+        <w:t>)</w:t>
+      </w:r>
+    </w:p>
+    <w:p>
+      <w:pPr>
+        <w:rPr>
+          <w:b/>
+          <w:bCs/>
+        </w:rPr>
+      </w:pPr>
+      <w:r>
+        <w:rPr>
+          <w:b/>
+          <w:bCs/>
+        </w:rPr>
+        <w:t>Las peticiones categorizadas fueron:</w:t>
+      </w:r>
+    </w:p>
+    <w:p>
+      <w:r>
+        <w:t>{'@1': {'solicitud': 'Consulta el consumo energético de la nevera durante la noche del día anterior.', 'escenario': '</w:t>
+      </w:r>
+      <w:proofErr w:type="spellStart"/>
+      <w:r>
+        <w:t>consumo_basico</w:t>
+      </w:r>
+      <w:proofErr w:type="spellEnd"/>
+      <w:r>
+        <w:t>', 'formato': '</w:t>
+      </w:r>
+      <w:proofErr w:type="spellStart"/>
+      <w:r>
+        <w:t>no_especificado</w:t>
+      </w:r>
+      <w:proofErr w:type="spellEnd"/>
+      <w:r>
+        <w:t>'}, '@2': {'solicitud': 'Consulta el consumo energético de la lavadora durante la mañana del sábado pasado.', 'escenario': '</w:t>
+      </w:r>
+      <w:proofErr w:type="spellStart"/>
+      <w:r>
+        <w:t>consumo_basico</w:t>
+      </w:r>
+      <w:proofErr w:type="spellEnd"/>
+      <w:r>
+        <w:t>', 'formato': '</w:t>
+      </w:r>
+      <w:proofErr w:type="spellStart"/>
+      <w:r>
+        <w:t>no_especificado</w:t>
+      </w:r>
+      <w:proofErr w:type="spellEnd"/>
+      <w:r>
+        <w:t>'}, '@3': {'solicitud': 'Compara el consumo de la nevera (noche del día anterior) y la lavadora (mañana del sábado pasado) para determinar cuál gastó más energía.', 'escenario': '</w:t>
+      </w:r>
+      <w:proofErr w:type="spellStart"/>
+      <w:r>
+        <w:t>comparacion_consumos</w:t>
+      </w:r>
+      <w:proofErr w:type="spellEnd"/>
+      <w:r>
+        <w:t>', 'formato': '</w:t>
+      </w:r>
+      <w:proofErr w:type="spellStart"/>
+      <w:r>
+        <w:t>no_especificado</w:t>
+      </w:r>
+      <w:proofErr w:type="spellEnd"/>
+      <w:r>
+        <w:t>'}, '@4': {'solicitud': 'Consulta el consumo de todos los dispositivos del hogar para el año 2024.', 'escenario': '</w:t>
+      </w:r>
+      <w:proofErr w:type="spellStart"/>
+      <w:r>
+        <w:t>consumo_basico</w:t>
+      </w:r>
+      <w:proofErr w:type="spellEnd"/>
+      <w:r>
+        <w:t>', 'formato': 'grafico'}}</w:t>
+      </w:r>
+    </w:p>
+    <w:p>
+      <w:pPr>
+        <w:rPr>
+          <w:b/>
+          <w:bCs/>
+        </w:rPr>
+      </w:pPr>
+      <w:r>
+        <w:rPr>
+          <w:b/>
+          <w:bCs/>
+        </w:rPr>
+        <w:t>Las notas tomadas fueron:</w:t>
+      </w:r>
+    </w:p>
+    <w:p>
+      <w:r>
+        <w:t>mientras miraba esos consumos se me descargó el celular y me dio mucha pereza pararme a buscar el cargador, pero igual quiero la comparación. Papá también pidió que le dijeras</w:t>
+      </w:r>
+    </w:p>
+    <w:p>
+      <w:pPr>
+        <w:pStyle w:val="Ttulo3"/>
+      </w:pPr>
+      <w:r>
+        <w:t xml:space="preserve">Resultado </w:t>
+      </w:r>
       <w:proofErr w:type="spellStart"/>
       <w:r>
         <w:t>Qwen</w:t>
@@ -4184,6 +4973,43 @@
       </w:r>
     </w:p>
     <w:p>
+      <w:r>
+        <w:t>{'@1': {'solicitud': 'Consultar el consumo energético registrado por la nevera durante la noche del día anterior.', 'escenario': '</w:t>
+      </w:r>
+      <w:proofErr w:type="spellStart"/>
+      <w:r>
+        <w:t>consumo_basico</w:t>
+      </w:r>
+      <w:proofErr w:type="spellEnd"/>
+      <w:r>
+        <w:t>', 'formato': 'texto'}, '@2': {'solicitud': 'Consultar el consumo energético registrado por la lavadora durante la mañana del sábado pasado.', 'escenario': '</w:t>
+      </w:r>
+      <w:proofErr w:type="spellStart"/>
+      <w:r>
+        <w:t>consumo_basico</w:t>
+      </w:r>
+      <w:proofErr w:type="spellEnd"/>
+      <w:r>
+        <w:t>', 'formato': 'texto'}, '@3': {'solicitud': 'Comparar el consumo energético de la nevera durante la noche del día anterior frente al consumo de la lavadora durante la mañana del sábado pasado, para determinar cuál gastó más energía.', 'escenario': '</w:t>
+      </w:r>
+      <w:proofErr w:type="spellStart"/>
+      <w:r>
+        <w:t>comparacion_consumos</w:t>
+      </w:r>
+      <w:proofErr w:type="spellEnd"/>
+      <w:r>
+        <w:t>', 'formato': 'texto'}, '@4': {'solicitud': 'Consultar el consumo total de todos los dispositivos del hogar durante el año 2024 y presentar gráficamente los resultados.', 'escenario': '</w:t>
+      </w:r>
+      <w:proofErr w:type="spellStart"/>
+      <w:r>
+        <w:t>consumo_basico</w:t>
+      </w:r>
+      <w:proofErr w:type="spellEnd"/>
+      <w:r>
+        <w:t>', 'formato': 'grafico'}}</w:t>
+      </w:r>
+    </w:p>
+    <w:p>
       <w:pPr>
         <w:rPr>
           <w:b/>
@@ -4199,34 +5025,57 @@
       </w:r>
     </w:p>
     <w:p>
+      <w:r>
+        <w:t>mientras miraba esos consumos se me descargó el celular y me dio mucha pereza pararme a buscar el cargador, pero igual quiero la comparación</w:t>
+      </w:r>
+    </w:p>
+    <w:p>
       <w:pPr>
         <w:pStyle w:val="Ttulo3"/>
-      </w:pPr>
-      <w:r>
-        <w:t xml:space="preserve">Resultado </w:t>
-      </w:r>
-      <w:proofErr w:type="spellStart"/>
-      <w:r>
+        <w:rPr>
+          <w:lang w:val="en-US"/>
+        </w:rPr>
+      </w:pPr>
+      <w:proofErr w:type="spellStart"/>
+      <w:r>
+        <w:rPr>
+          <w:lang w:val="en-US"/>
+        </w:rPr>
+        <w:t>Resultado</w:t>
+      </w:r>
+      <w:proofErr w:type="spellEnd"/>
+      <w:r>
+        <w:rPr>
+          <w:lang w:val="en-US"/>
+        </w:rPr>
+        <w:t xml:space="preserve"> </w:t>
+      </w:r>
+      <w:proofErr w:type="spellStart"/>
+      <w:r>
+        <w:rPr>
+          <w:lang w:val="en-US"/>
+        </w:rPr>
         <w:t>Deepseek</w:t>
       </w:r>
       <w:proofErr w:type="spellEnd"/>
       <w:r>
-        <w:t xml:space="preserve"> R1 T2 </w:t>
-      </w:r>
-      <w:proofErr w:type="spellStart"/>
-      <w:r>
-        <w:t>Chimera</w:t>
-      </w:r>
-      <w:proofErr w:type="spellEnd"/>
-      <w:r>
-        <w:t xml:space="preserve"> 671b (</w:t>
-      </w:r>
-      <w:proofErr w:type="spellStart"/>
-      <w:r>
+        <w:rPr>
+          <w:lang w:val="en-US"/>
+        </w:rPr>
+        <w:t xml:space="preserve"> R1 T2 Chimera 671b (</w:t>
+      </w:r>
+      <w:proofErr w:type="spellStart"/>
+      <w:r>
+        <w:rPr>
+          <w:lang w:val="en-US"/>
+        </w:rPr>
         <w:t>OpenRouter</w:t>
       </w:r>
       <w:proofErr w:type="spellEnd"/>
       <w:r>
+        <w:rPr>
+          <w:lang w:val="en-US"/>
+        </w:rPr>
         <w:t>)</w:t>
       </w:r>
     </w:p>
@@ -4246,6 +5095,67 @@
       </w:r>
     </w:p>
     <w:p>
+      <w:r>
+        <w:t>{'@1': {'solicitud': 'Consumo de la nevera ayer por la noche', 'escenario': '</w:t>
+      </w:r>
+      <w:proofErr w:type="spellStart"/>
+      <w:r>
+        <w:t>consumo_basico</w:t>
+      </w:r>
+      <w:proofErr w:type="spellEnd"/>
+      <w:r>
+        <w:t>', 'formato': '</w:t>
+      </w:r>
+      <w:proofErr w:type="spellStart"/>
+      <w:r>
+        <w:t>no_especificado</w:t>
+      </w:r>
+      <w:proofErr w:type="spellEnd"/>
+      <w:r>
+        <w:t>'}, '@2': {'solicitud': 'Consumo de la lavadora el sábado pasado en la mañana', 'escenario': '</w:t>
+      </w:r>
+      <w:proofErr w:type="spellStart"/>
+      <w:r>
+        <w:t>consumo_basico</w:t>
+      </w:r>
+      <w:proofErr w:type="spellEnd"/>
+      <w:r>
+        <w:t>', 'formato': '</w:t>
+      </w:r>
+      <w:proofErr w:type="spellStart"/>
+      <w:r>
+        <w:t>no_especificado</w:t>
+      </w:r>
+      <w:proofErr w:type="spellEnd"/>
+      <w:r>
+        <w:t>'}, '@3': {'solicitud': 'Comparación de consumo energético entre la nevera (ayer noche) y la lavadora (sábado pasado mañana) para determinar cuál gastó más', 'escenario': '</w:t>
+      </w:r>
+      <w:proofErr w:type="spellStart"/>
+      <w:r>
+        <w:t>comparacion_consumos</w:t>
+      </w:r>
+      <w:proofErr w:type="spellEnd"/>
+      <w:r>
+        <w:t>', 'formato': '</w:t>
+      </w:r>
+      <w:proofErr w:type="spellStart"/>
+      <w:r>
+        <w:t>no_especificado</w:t>
+      </w:r>
+      <w:proofErr w:type="spellEnd"/>
+      <w:r>
+        <w:t>'}, '@4': {'solicitud': 'Consumo total de todos los dispositivos en el año 2024 con presentación gráfica', 'escenario': '</w:t>
+      </w:r>
+      <w:proofErr w:type="spellStart"/>
+      <w:r>
+        <w:t>consumo_basico</w:t>
+      </w:r>
+      <w:proofErr w:type="spellEnd"/>
+      <w:r>
+        <w:t>', 'formato': 'grafico'}}</w:t>
+      </w:r>
+    </w:p>
+    <w:p>
       <w:pPr>
         <w:rPr>
           <w:b/>
@@ -4268,6 +5178,11 @@
       </w:r>
     </w:p>
     <w:p>
+      <w:r>
+        <w:t>"mientras miraba esos consumos se me descargó el celular y me dio mucha pereza pararme a buscar el cargador, pero igual quiero la comparación"</w:t>
+      </w:r>
+    </w:p>
+    <w:p>
       <w:pPr>
         <w:pStyle w:val="Ttulo3"/>
       </w:pPr>
@@ -4275,13 +5190,51 @@
         <w:t>Análisis</w:t>
       </w:r>
     </w:p>
-    <w:p/>
+    <w:p>
+      <w:r>
+        <w:t xml:space="preserve">En el caso de Mistral, al igual que Gwen en la prueba anterior, mostraron problemas al adaptarse al formato inducido por </w:t>
+      </w:r>
+      <w:proofErr w:type="spellStart"/>
+      <w:r>
+        <w:t>Dspy</w:t>
+      </w:r>
+      <w:proofErr w:type="spellEnd"/>
+      <w:r>
+        <w:t>.</w:t>
+      </w:r>
+    </w:p>
     <w:p>
       <w:pPr>
         <w:pStyle w:val="Ttulo2"/>
       </w:pPr>
       <w:r>
         <w:t>Cuarta prueba</w:t>
+      </w:r>
+    </w:p>
+    <w:p>
+      <w:pPr>
+        <w:pStyle w:val="Prrafodelista"/>
+        <w:numPr>
+          <w:ilvl w:val="0"/>
+          <w:numId w:val="6"/>
+        </w:numPr>
+      </w:pPr>
+      <w:r>
+        <w:t xml:space="preserve">Se mejora la descripción de las variables de entradas y salidas en la </w:t>
+      </w:r>
+      <w:proofErr w:type="spellStart"/>
+      <w:r>
+        <w:t>signature</w:t>
+      </w:r>
+      <w:proofErr w:type="spellEnd"/>
+      <w:r>
+        <w:t xml:space="preserve">, tal que </w:t>
+      </w:r>
+      <w:r>
+        <w:t>el modelo tenga una mejor guía</w:t>
+      </w:r>
+      <w:r>
+        <w:t xml:space="preserve"> y la estructura se más sencilla de interpretar. </w:t>
       </w:r>
     </w:p>
     <w:p>
@@ -4782,6 +5735,95 @@
     </w:lvl>
   </w:abstractNum>
   <w:abstractNum w:abstractNumId="3" w15:restartNumberingAfterBreak="0">
+    <w:nsid w:val="6D7E47E3"/>
+    <w:multiLevelType w:val="hybridMultilevel"/>
+    <w:tmpl w:val="4830D43E"/>
+    <w:lvl w:ilvl="0" w:tplc="240A0011">
+      <w:start w:val="1"/>
+      <w:numFmt w:val="decimal"/>
+      <w:lvlText w:val="%1)"/>
+      <w:lvlJc w:val="left"/>
+      <w:pPr>
+        <w:ind w:left="720" w:hanging="360"/>
+      </w:pPr>
+      <w:rPr>
+        <w:rFonts w:hint="default"/>
+      </w:rPr>
+    </w:lvl>
+    <w:lvl w:ilvl="1" w:tplc="240A0019" w:tentative="1">
+      <w:start w:val="1"/>
+      <w:numFmt w:val="lowerLetter"/>
+      <w:lvlText w:val="%2."/>
+      <w:lvlJc w:val="left"/>
+      <w:pPr>
+        <w:ind w:left="1440" w:hanging="360"/>
+      </w:pPr>
+    </w:lvl>
+    <w:lvl w:ilvl="2" w:tplc="240A001B" w:tentative="1">
+      <w:start w:val="1"/>
+      <w:numFmt w:val="lowerRoman"/>
+      <w:lvlText w:val="%3."/>
+      <w:lvlJc w:val="right"/>
+      <w:pPr>
+        <w:ind w:left="2160" w:hanging="180"/>
+      </w:pPr>
+    </w:lvl>
+    <w:lvl w:ilvl="3" w:tplc="240A000F" w:tentative="1">
+      <w:start w:val="1"/>
+      <w:numFmt w:val="decimal"/>
+      <w:lvlText w:val="%4."/>
+      <w:lvlJc w:val="left"/>
+      <w:pPr>
+        <w:ind w:left="2880" w:hanging="360"/>
+      </w:pPr>
+    </w:lvl>
+    <w:lvl w:ilvl="4" w:tplc="240A0019" w:tentative="1">
+      <w:start w:val="1"/>
+      <w:numFmt w:val="lowerLetter"/>
+      <w:lvlText w:val="%5."/>
+      <w:lvlJc w:val="left"/>
+      <w:pPr>
+        <w:ind w:left="3600" w:hanging="360"/>
+      </w:pPr>
+    </w:lvl>
+    <w:lvl w:ilvl="5" w:tplc="240A001B" w:tentative="1">
+      <w:start w:val="1"/>
+      <w:numFmt w:val="lowerRoman"/>
+      <w:lvlText w:val="%6."/>
+      <w:lvlJc w:val="right"/>
+      <w:pPr>
+        <w:ind w:left="4320" w:hanging="180"/>
+      </w:pPr>
+    </w:lvl>
+    <w:lvl w:ilvl="6" w:tplc="240A000F" w:tentative="1">
+      <w:start w:val="1"/>
+      <w:numFmt w:val="decimal"/>
+      <w:lvlText w:val="%7."/>
+      <w:lvlJc w:val="left"/>
+      <w:pPr>
+        <w:ind w:left="5040" w:hanging="360"/>
+      </w:pPr>
+    </w:lvl>
+    <w:lvl w:ilvl="7" w:tplc="240A0019" w:tentative="1">
+      <w:start w:val="1"/>
+      <w:numFmt w:val="lowerLetter"/>
+      <w:lvlText w:val="%8."/>
+      <w:lvlJc w:val="left"/>
+      <w:pPr>
+        <w:ind w:left="5760" w:hanging="360"/>
+      </w:pPr>
+    </w:lvl>
+    <w:lvl w:ilvl="8" w:tplc="240A001B" w:tentative="1">
+      <w:start w:val="1"/>
+      <w:numFmt w:val="lowerRoman"/>
+      <w:lvlText w:val="%9."/>
+      <w:lvlJc w:val="right"/>
+      <w:pPr>
+        <w:ind w:left="6480" w:hanging="180"/>
+      </w:pPr>
+    </w:lvl>
+  </w:abstractNum>
+  <w:abstractNum w:abstractNumId="4" w15:restartNumberingAfterBreak="0">
     <w:nsid w:val="7A283338"/>
     <w:multiLevelType w:val="multilevel"/>
     <w:tmpl w:val="4AEC9762"/>
@@ -4930,7 +5972,7 @@
       </w:rPr>
     </w:lvl>
   </w:abstractNum>
-  <w:abstractNum w:abstractNumId="4" w15:restartNumberingAfterBreak="0">
+  <w:abstractNum w:abstractNumId="5" w15:restartNumberingAfterBreak="0">
     <w:nsid w:val="7B106EA0"/>
     <w:multiLevelType w:val="multilevel"/>
     <w:tmpl w:val="60C4AE9E"/>
@@ -5089,9 +6131,12 @@
     <w:abstractNumId w:val="1"/>
   </w:num>
   <w:num w:numId="4" w16cid:durableId="676269012">
+    <w:abstractNumId w:val="5"/>
+  </w:num>
+  <w:num w:numId="5" w16cid:durableId="2110345886">
     <w:abstractNumId w:val="4"/>
   </w:num>
-  <w:num w:numId="5" w16cid:durableId="2110345886">
+  <w:num w:numId="6" w16cid:durableId="1954438591">
     <w:abstractNumId w:val="3"/>
   </w:num>
 </w:numbering>
@@ -5698,6 +6743,7 @@
   <w:style w:type="character" w:default="1" w:styleId="Fuentedeprrafopredeter">
     <w:name w:val="Default Paragraph Font"/>
     <w:uiPriority w:val="1"/>
+    <w:semiHidden/>
     <w:unhideWhenUsed/>
   </w:style>
   <w:style w:type="table" w:default="1" w:styleId="Tablanormal">

</xml_diff>